<commit_message>
External REF3030 ADC reference; full review and documentation update
- U19 REF3030AIDBZR (3.000 V +/-0.2 %, LCSC C38423) + C85 drive VREF+ (new net
  VREF_ADC); VREF+ separated from VDDA; R25 (IL zero) and R29 (NTC pull-up)
  moved to VREF_ADC so those channels are ratiometric
- Full scales: VBUS/VOUT 61.8 V, IL +/-18.75 A, IOUT 6.0 A, DAC/COMP 0-3.0 V
- PCB: U19/C85 placed and routed, pins 28/29 hand-routed; DRC clean, parity
  OK, isolation 4.0 mm
- Design notes (DOCX/PDF), root and firmware READMEs, pin-map, layout review
  image, BOM, Gerbers, CPL, EasyEDA zip and PDFs updated

Co-Authored-By: Claude Opus 5.5 <noreply@anthropic.com>
Claude-Session: https://claude.ai/code/session_01A35wrnwFKLPSaRSxxHs471
</commit_message>
<xml_diff>
--- a/01_hardware/docs/DCDC_Design_Notes.docx
+++ b/01_hardware/docs/DCDC_Design_Notes.docx
@@ -420,7 +420,7 @@
         <w:t xml:space="preserve">Rev D changes:</w:t>
       </w:r>
       <w:r>
-        <w:t xml:space="preserve"> NTC moved from PA4 to PA6, so PA4 is free for DAC1_OUT1. 10k pull-downs added on the unused MCU pins (R93 now doubles as the PA2 pull-down for the VIN monitor). HSE changed to 16 MHz. Primary input OVP (50.26 V rising) reports through U12 channel 1 to PA15 / HRTIM1_FLT2, and an isolated VIN monitor (ramp-comparator PWM) reports through channel 2 to PA2 / TIM15_CH1. Fifteen test pads added on quiet nodes. PQ2620 footprint pitch corrected to 3.8 mm within a group of pins and 7.5 mm between pins 3 and 4. Schematic text overlaps cleaned up. The PCB was re-placed and re-routed with tight power loops, and the silkscreen was cleaned up (see PCB).</w:t>
+        <w:t xml:space="preserve"> NTC moved from PA4 to PA6, so PA4 is free for DAC1_OUT1. 10k pull-downs added on the unused MCU pins (R93 now doubles as the PA2 pull-down for the VIN monitor). HSE changed to 16 MHz. Primary input OVP (50.26 V rising) reports through U12 channel 1 to PA15 / HRTIM1_FLT2, and an isolated VIN monitor (ramp-comparator PWM) reports through channel 2 to PA2 / TIM15_CH1. The ADC, DAC and comparator reference is now an external REF3030 (3.000 V ±0.2 %) on VREF+, no longer the isolator's 3.3 V rail. Fifteen test pads added on quiet nodes. PQ2620 footprint pitch corrected to 3.8 mm within a group of pins and 7.5 mm between pins 3 and 4. Schematic text overlaps cleaned up. The PCB was re-placed and re-routed with tight power loops, and the silkscreen was cleaned up (see PCB).</w:t>
       </w:r>
     </w:p>
     <w:p>
@@ -2090,7 +2090,7 @@
     <w:p>
       <w:pPr/>
       <w:r>
-        <w:t xml:space="preserve">Inductor current is sensed by one 4 mOhm resistor in the common source return of Q2 and Q4 (the LM5175 scheme). It reads positive in boost and negative in buck, so U7 (INA181A1, gain 20) is offset to half of 3.3 V. Output current for the CC loop uses a 10 mOhm low-side shunt and U8 (INA181A2, gain 50). VREF+ is configured as an input and tied to VDDA (+3V3A, 3.3 V) with 1 uF + 100 nF, so all ADC full scales are 3.3 V; the U7 offset is 1.65 V.</w:t>
+        <w:t xml:space="preserve">Inductor current is sensed by one 4 mOhm resistor in the common source return of Q2 and Q4 (the LM5175 scheme). It reads positive in boost and negative in buck, so U7 (INA181A1, gain 20) is offset to half of VREF+ (1.50 V). Output current for the CC loop uses a 10 mOhm low-side shunt and U8 (INA181A2, gain 50). VREF+ is driven by an external REF3030 (3.000 V ±0.2 %, U19) with 1 uF + 100 nF, so all ADC, DAC and comparator full scales are 3.0 V; the U7 offset is 1.50 V.</w:t>
       </w:r>
     </w:p>
     <w:tbl>
@@ -2101,10 +2101,10 @@
         <w:tblLook w:val="04A0" w:firstRow="1" w:lastRow="0" w:firstColumn="0" w:lastColumn="0" w:noHBand="0" w:noVBand="1"/>
       </w:tblPr>
       <w:tblGrid>
-        <w:gridCol w:w="1039"/>
-        <w:gridCol w:w="1554"/>
+        <w:gridCol w:w="1027"/>
+        <w:gridCol w:w="1553"/>
         <w:gridCol w:w="4920"/>
-        <w:gridCol w:w="1847"/>
+        <w:gridCol w:w="1860"/>
       </w:tblGrid>
       <w:tr>
         <w:trPr>
@@ -2112,7 +2112,7 @@
         </w:trPr>
         <w:tc>
           <w:tcPr>
-            <w:tcW w:w="1039" w:type="dxa"/>
+            <w:tcW w:w="1027" w:type="dxa"/>
             <w:shd w:val="clear" w:color="auto" w:fill="F2F2F2"/>
           </w:tcPr>
           <w:p>
@@ -2124,7 +2124,7 @@
         </w:tc>
         <w:tc>
           <w:tcPr>
-            <w:tcW w:w="1554" w:type="dxa"/>
+            <w:tcW w:w="1553" w:type="dxa"/>
             <w:shd w:val="clear" w:color="auto" w:fill="F2F2F2"/>
           </w:tcPr>
           <w:p>
@@ -2148,7 +2148,7 @@
         </w:tc>
         <w:tc>
           <w:tcPr>
-            <w:tcW w:w="1847" w:type="dxa"/>
+            <w:tcW w:w="1860" w:type="dxa"/>
             <w:shd w:val="clear" w:color="auto" w:fill="F2F2F2"/>
           </w:tcPr>
           <w:p>
@@ -2162,7 +2162,7 @@
       <w:tr>
         <w:tc>
           <w:tcPr>
-            <w:tcW w:w="1039" w:type="dxa"/>
+            <w:tcW w:w="1027" w:type="dxa"/>
           </w:tcPr>
           <w:p>
             <w:pPr/>
@@ -2173,7 +2173,7 @@
         </w:tc>
         <w:tc>
           <w:tcPr>
-            <w:tcW w:w="1554" w:type="dxa"/>
+            <w:tcW w:w="1553" w:type="dxa"/>
           </w:tcPr>
           <w:p>
             <w:pPr/>
@@ -2195,7 +2195,7 @@
         </w:tc>
         <w:tc>
           <w:tcPr>
-            <w:tcW w:w="1847" w:type="dxa"/>
+            <w:tcW w:w="1860" w:type="dxa"/>
           </w:tcPr>
           <w:p>
             <w:pPr/>
@@ -2208,7 +2208,7 @@
       <w:tr>
         <w:tc>
           <w:tcPr>
-            <w:tcW w:w="1039" w:type="dxa"/>
+            <w:tcW w:w="1027" w:type="dxa"/>
           </w:tcPr>
           <w:p>
             <w:pPr/>
@@ -2219,7 +2219,7 @@
         </w:tc>
         <w:tc>
           <w:tcPr>
-            <w:tcW w:w="1554" w:type="dxa"/>
+            <w:tcW w:w="1553" w:type="dxa"/>
           </w:tcPr>
           <w:p>
             <w:pPr/>
@@ -2241,7 +2241,7 @@
         </w:tc>
         <w:tc>
           <w:tcPr>
-            <w:tcW w:w="1847" w:type="dxa"/>
+            <w:tcW w:w="1860" w:type="dxa"/>
           </w:tcPr>
           <w:p>
             <w:pPr/>
@@ -2254,7 +2254,7 @@
       <w:tr>
         <w:tc>
           <w:tcPr>
-            <w:tcW w:w="1039" w:type="dxa"/>
+            <w:tcW w:w="1027" w:type="dxa"/>
           </w:tcPr>
           <w:p>
             <w:pPr/>
@@ -2265,7 +2265,7 @@
         </w:tc>
         <w:tc>
           <w:tcPr>
-            <w:tcW w:w="1554" w:type="dxa"/>
+            <w:tcW w:w="1553" w:type="dxa"/>
           </w:tcPr>
           <w:p>
             <w:pPr/>
@@ -2287,7 +2287,7 @@
         </w:tc>
         <w:tc>
           <w:tcPr>
-            <w:tcW w:w="1847" w:type="dxa"/>
+            <w:tcW w:w="1860" w:type="dxa"/>
           </w:tcPr>
           <w:p>
             <w:pPr/>
@@ -2300,7 +2300,7 @@
       <w:tr>
         <w:tc>
           <w:tcPr>
-            <w:tcW w:w="1039" w:type="dxa"/>
+            <w:tcW w:w="1027" w:type="dxa"/>
           </w:tcPr>
           <w:p>
             <w:pPr/>
@@ -2311,7 +2311,7 @@
         </w:tc>
         <w:tc>
           <w:tcPr>
-            <w:tcW w:w="1554" w:type="dxa"/>
+            <w:tcW w:w="1553" w:type="dxa"/>
           </w:tcPr>
           <w:p>
             <w:pPr/>
@@ -2327,13 +2327,13 @@
           <w:p>
             <w:pPr/>
             <w:r>
-              <w:t xml:space="preserve">ADC1_IN1, VBUS about equal to VIN (100k / 5.1k, FS 68 V)</w:t>
-            </w:r>
-          </w:p>
-        </w:tc>
-        <w:tc>
-          <w:tcPr>
-            <w:tcW w:w="1847" w:type="dxa"/>
+              <w:t xml:space="preserve">ADC1_IN1, VBUS about equal to VIN (100k / 5.1k, FS 61.8 V)</w:t>
+            </w:r>
+          </w:p>
+        </w:tc>
+        <w:tc>
+          <w:tcPr>
+            <w:tcW w:w="1860" w:type="dxa"/>
           </w:tcPr>
           <w:p>
             <w:pPr/>
@@ -2346,7 +2346,7 @@
       <w:tr>
         <w:tc>
           <w:tcPr>
-            <w:tcW w:w="1039" w:type="dxa"/>
+            <w:tcW w:w="1027" w:type="dxa"/>
           </w:tcPr>
           <w:p>
             <w:pPr/>
@@ -2357,7 +2357,7 @@
         </w:tc>
         <w:tc>
           <w:tcPr>
-            <w:tcW w:w="1554" w:type="dxa"/>
+            <w:tcW w:w="1553" w:type="dxa"/>
           </w:tcPr>
           <w:p>
             <w:pPr/>
@@ -2379,7 +2379,7 @@
         </w:tc>
         <w:tc>
           <w:tcPr>
-            <w:tcW w:w="1847" w:type="dxa"/>
+            <w:tcW w:w="1860" w:type="dxa"/>
           </w:tcPr>
           <w:p>
             <w:pPr/>
@@ -2392,7 +2392,7 @@
       <w:tr>
         <w:tc>
           <w:tcPr>
-            <w:tcW w:w="1039" w:type="dxa"/>
+            <w:tcW w:w="1027" w:type="dxa"/>
           </w:tcPr>
           <w:p>
             <w:pPr/>
@@ -2403,7 +2403,7 @@
         </w:tc>
         <w:tc>
           <w:tcPr>
-            <w:tcW w:w="1554" w:type="dxa"/>
+            <w:tcW w:w="1553" w:type="dxa"/>
           </w:tcPr>
           <w:p>
             <w:pPr/>
@@ -2425,7 +2425,7 @@
         </w:tc>
         <w:tc>
           <w:tcPr>
-            <w:tcW w:w="1847" w:type="dxa"/>
+            <w:tcW w:w="1860" w:type="dxa"/>
           </w:tcPr>
           <w:p>
             <w:pPr/>
@@ -2438,7 +2438,7 @@
       <w:tr>
         <w:tc>
           <w:tcPr>
-            <w:tcW w:w="1039" w:type="dxa"/>
+            <w:tcW w:w="1027" w:type="dxa"/>
           </w:tcPr>
           <w:p>
             <w:pPr/>
@@ -2449,7 +2449,7 @@
         </w:tc>
         <w:tc>
           <w:tcPr>
-            <w:tcW w:w="1554" w:type="dxa"/>
+            <w:tcW w:w="1553" w:type="dxa"/>
           </w:tcPr>
           <w:p>
             <w:pPr/>
@@ -2471,7 +2471,7 @@
         </w:tc>
         <w:tc>
           <w:tcPr>
-            <w:tcW w:w="1847" w:type="dxa"/>
+            <w:tcW w:w="1860" w:type="dxa"/>
           </w:tcPr>
           <w:p>
             <w:pPr/>
@@ -2484,7 +2484,7 @@
       <w:tr>
         <w:tc>
           <w:tcPr>
-            <w:tcW w:w="1039" w:type="dxa"/>
+            <w:tcW w:w="1027" w:type="dxa"/>
           </w:tcPr>
           <w:p>
             <w:pPr/>
@@ -2495,7 +2495,7 @@
         </w:tc>
         <w:tc>
           <w:tcPr>
-            <w:tcW w:w="1554" w:type="dxa"/>
+            <w:tcW w:w="1553" w:type="dxa"/>
           </w:tcPr>
           <w:p>
             <w:pPr/>
@@ -2517,7 +2517,7 @@
         </w:tc>
         <w:tc>
           <w:tcPr>
-            <w:tcW w:w="1847" w:type="dxa"/>
+            <w:tcW w:w="1860" w:type="dxa"/>
           </w:tcPr>
           <w:p>
             <w:pPr/>
@@ -2530,7 +2530,7 @@
       <w:tr>
         <w:tc>
           <w:tcPr>
-            <w:tcW w:w="1039" w:type="dxa"/>
+            <w:tcW w:w="1027" w:type="dxa"/>
           </w:tcPr>
           <w:p>
             <w:pPr/>
@@ -2541,7 +2541,7 @@
         </w:tc>
         <w:tc>
           <w:tcPr>
-            <w:tcW w:w="1554" w:type="dxa"/>
+            <w:tcW w:w="1553" w:type="dxa"/>
           </w:tcPr>
           <w:p>
             <w:pPr/>
@@ -2563,7 +2563,7 @@
         </w:tc>
         <w:tc>
           <w:tcPr>
-            <w:tcW w:w="1847" w:type="dxa"/>
+            <w:tcW w:w="1860" w:type="dxa"/>
           </w:tcPr>
           <w:p>
             <w:pPr/>
@@ -2576,7 +2576,7 @@
       <w:tr>
         <w:tc>
           <w:tcPr>
-            <w:tcW w:w="1039" w:type="dxa"/>
+            <w:tcW w:w="1027" w:type="dxa"/>
           </w:tcPr>
           <w:p>
             <w:pPr/>
@@ -2587,7 +2587,7 @@
         </w:tc>
         <w:tc>
           <w:tcPr>
-            <w:tcW w:w="1554" w:type="dxa"/>
+            <w:tcW w:w="1553" w:type="dxa"/>
           </w:tcPr>
           <w:p>
             <w:pPr/>
@@ -2609,7 +2609,7 @@
         </w:tc>
         <w:tc>
           <w:tcPr>
-            <w:tcW w:w="1847" w:type="dxa"/>
+            <w:tcW w:w="1860" w:type="dxa"/>
           </w:tcPr>
           <w:p>
             <w:pPr/>
@@ -2622,7 +2622,7 @@
       <w:tr>
         <w:tc>
           <w:tcPr>
-            <w:tcW w:w="1039" w:type="dxa"/>
+            <w:tcW w:w="1027" w:type="dxa"/>
           </w:tcPr>
           <w:p>
             <w:pPr/>
@@ -2633,7 +2633,7 @@
         </w:tc>
         <w:tc>
           <w:tcPr>
-            <w:tcW w:w="1554" w:type="dxa"/>
+            <w:tcW w:w="1553" w:type="dxa"/>
           </w:tcPr>
           <w:p>
             <w:pPr/>
@@ -2655,7 +2655,7 @@
         </w:tc>
         <w:tc>
           <w:tcPr>
-            <w:tcW w:w="1847" w:type="dxa"/>
+            <w:tcW w:w="1860" w:type="dxa"/>
           </w:tcPr>
           <w:p>
             <w:pPr/>
@@ -2668,7 +2668,7 @@
       <w:tr>
         <w:tc>
           <w:tcPr>
-            <w:tcW w:w="1039" w:type="dxa"/>
+            <w:tcW w:w="1027" w:type="dxa"/>
           </w:tcPr>
           <w:p>
             <w:pPr/>
@@ -2679,7 +2679,7 @@
         </w:tc>
         <w:tc>
           <w:tcPr>
-            <w:tcW w:w="1554" w:type="dxa"/>
+            <w:tcW w:w="1553" w:type="dxa"/>
           </w:tcPr>
           <w:p>
             <w:pPr/>
@@ -2701,7 +2701,7 @@
         </w:tc>
         <w:tc>
           <w:tcPr>
-            <w:tcW w:w="1847" w:type="dxa"/>
+            <w:tcW w:w="1860" w:type="dxa"/>
           </w:tcPr>
           <w:p>
             <w:pPr/>
@@ -2714,7 +2714,7 @@
       <w:tr>
         <w:tc>
           <w:tcPr>
-            <w:tcW w:w="1039" w:type="dxa"/>
+            <w:tcW w:w="1027" w:type="dxa"/>
           </w:tcPr>
           <w:p>
             <w:pPr/>
@@ -2725,7 +2725,7 @@
         </w:tc>
         <w:tc>
           <w:tcPr>
-            <w:tcW w:w="1554" w:type="dxa"/>
+            <w:tcW w:w="1553" w:type="dxa"/>
           </w:tcPr>
           <w:p>
             <w:pPr/>
@@ -2747,7 +2747,7 @@
         </w:tc>
         <w:tc>
           <w:tcPr>
-            <w:tcW w:w="1847" w:type="dxa"/>
+            <w:tcW w:w="1860" w:type="dxa"/>
           </w:tcPr>
           <w:p>
             <w:pPr/>
@@ -2760,7 +2760,7 @@
       <w:tr>
         <w:tc>
           <w:tcPr>
-            <w:tcW w:w="1039" w:type="dxa"/>
+            <w:tcW w:w="1027" w:type="dxa"/>
           </w:tcPr>
           <w:p>
             <w:pPr/>
@@ -2771,7 +2771,7 @@
         </w:tc>
         <w:tc>
           <w:tcPr>
-            <w:tcW w:w="1554" w:type="dxa"/>
+            <w:tcW w:w="1553" w:type="dxa"/>
           </w:tcPr>
           <w:p>
             <w:pPr/>
@@ -2793,7 +2793,7 @@
         </w:tc>
         <w:tc>
           <w:tcPr>
-            <w:tcW w:w="1847" w:type="dxa"/>
+            <w:tcW w:w="1860" w:type="dxa"/>
           </w:tcPr>
           <w:p>
             <w:pPr/>
@@ -2806,7 +2806,7 @@
       <w:tr>
         <w:tc>
           <w:tcPr>
-            <w:tcW w:w="1039" w:type="dxa"/>
+            <w:tcW w:w="1027" w:type="dxa"/>
           </w:tcPr>
           <w:p>
             <w:pPr/>
@@ -2817,7 +2817,7 @@
         </w:tc>
         <w:tc>
           <w:tcPr>
-            <w:tcW w:w="1554" w:type="dxa"/>
+            <w:tcW w:w="1553" w:type="dxa"/>
           </w:tcPr>
           <w:p>
             <w:pPr/>
@@ -2839,7 +2839,7 @@
         </w:tc>
         <w:tc>
           <w:tcPr>
-            <w:tcW w:w="1847" w:type="dxa"/>
+            <w:tcW w:w="1860" w:type="dxa"/>
           </w:tcPr>
           <w:p>
             <w:pPr/>
@@ -2852,7 +2852,7 @@
       <w:tr>
         <w:tc>
           <w:tcPr>
-            <w:tcW w:w="1039" w:type="dxa"/>
+            <w:tcW w:w="1027" w:type="dxa"/>
           </w:tcPr>
           <w:p>
             <w:pPr/>
@@ -2863,7 +2863,7 @@
         </w:tc>
         <w:tc>
           <w:tcPr>
-            <w:tcW w:w="1554" w:type="dxa"/>
+            <w:tcW w:w="1553" w:type="dxa"/>
           </w:tcPr>
           <w:p>
             <w:pPr/>
@@ -2885,7 +2885,7 @@
         </w:tc>
         <w:tc>
           <w:tcPr>
-            <w:tcW w:w="1847" w:type="dxa"/>
+            <w:tcW w:w="1860" w:type="dxa"/>
           </w:tcPr>
           <w:p>
             <w:pPr/>
@@ -2898,7 +2898,7 @@
       <w:tr>
         <w:tc>
           <w:tcPr>
-            <w:tcW w:w="1039" w:type="dxa"/>
+            <w:tcW w:w="1027" w:type="dxa"/>
           </w:tcPr>
           <w:p>
             <w:pPr/>
@@ -2909,7 +2909,7 @@
         </w:tc>
         <w:tc>
           <w:tcPr>
-            <w:tcW w:w="1554" w:type="dxa"/>
+            <w:tcW w:w="1553" w:type="dxa"/>
           </w:tcPr>
           <w:p>
             <w:pPr/>
@@ -2931,7 +2931,7 @@
         </w:tc>
         <w:tc>
           <w:tcPr>
-            <w:tcW w:w="1847" w:type="dxa"/>
+            <w:tcW w:w="1860" w:type="dxa"/>
           </w:tcPr>
           <w:p>
             <w:pPr/>
@@ -2944,7 +2944,7 @@
       <w:tr>
         <w:tc>
           <w:tcPr>
-            <w:tcW w:w="1039" w:type="dxa"/>
+            <w:tcW w:w="1027" w:type="dxa"/>
           </w:tcPr>
           <w:p>
             <w:pPr/>
@@ -2955,7 +2955,7 @@
         </w:tc>
         <w:tc>
           <w:tcPr>
-            <w:tcW w:w="1554" w:type="dxa"/>
+            <w:tcW w:w="1553" w:type="dxa"/>
           </w:tcPr>
           <w:p>
             <w:pPr/>
@@ -2977,7 +2977,7 @@
         </w:tc>
         <w:tc>
           <w:tcPr>
-            <w:tcW w:w="1847" w:type="dxa"/>
+            <w:tcW w:w="1860" w:type="dxa"/>
           </w:tcPr>
           <w:p>
             <w:pPr/>
@@ -2990,7 +2990,53 @@
       <w:tr>
         <w:tc>
           <w:tcPr>
-            <w:tcW w:w="1039" w:type="dxa"/>
+            <w:tcW w:w="1027" w:type="dxa"/>
+          </w:tcPr>
+          <w:p>
+            <w:pPr/>
+            <w:r>
+              <w:t xml:space="preserve">28</w:t>
+            </w:r>
+          </w:p>
+        </w:tc>
+        <w:tc>
+          <w:tcPr>
+            <w:tcW w:w="1553" w:type="dxa"/>
+          </w:tcPr>
+          <w:p>
+            <w:pPr/>
+            <w:r>
+              <w:t xml:space="preserve">VREF+</w:t>
+            </w:r>
+          </w:p>
+        </w:tc>
+        <w:tc>
+          <w:tcPr>
+            <w:tcW w:w="4920" w:type="dxa"/>
+          </w:tcPr>
+          <w:p>
+            <w:pPr/>
+            <w:r>
+              <w:t xml:space="preserve">ADC / DAC / COMP reference input from REF3030 3.000 V (U19); VREFBUF disabled</w:t>
+            </w:r>
+          </w:p>
+        </w:tc>
+        <w:tc>
+          <w:tcPr>
+            <w:tcW w:w="1860" w:type="dxa"/>
+          </w:tcPr>
+          <w:p>
+            <w:pPr/>
+            <w:r>
+              <w:t xml:space="preserve">VREF_ADC</w:t>
+            </w:r>
+          </w:p>
+        </w:tc>
+      </w:tr>
+      <w:tr>
+        <w:tc>
+          <w:tcPr>
+            <w:tcW w:w="1027" w:type="dxa"/>
           </w:tcPr>
           <w:p>
             <w:pPr/>
@@ -3001,7 +3047,7 @@
         </w:tc>
         <w:tc>
           <w:tcPr>
-            <w:tcW w:w="1554" w:type="dxa"/>
+            <w:tcW w:w="1553" w:type="dxa"/>
           </w:tcPr>
           <w:p>
             <w:pPr/>
@@ -3023,7 +3069,7 @@
         </w:tc>
         <w:tc>
           <w:tcPr>
-            <w:tcW w:w="1847" w:type="dxa"/>
+            <w:tcW w:w="1860" w:type="dxa"/>
           </w:tcPr>
           <w:p>
             <w:pPr/>
@@ -3036,7 +3082,7 @@
       <w:tr>
         <w:tc>
           <w:tcPr>
-            <w:tcW w:w="1039" w:type="dxa"/>
+            <w:tcW w:w="1027" w:type="dxa"/>
           </w:tcPr>
           <w:p>
             <w:pPr/>
@@ -3047,7 +3093,7 @@
         </w:tc>
         <w:tc>
           <w:tcPr>
-            <w:tcW w:w="1554" w:type="dxa"/>
+            <w:tcW w:w="1553" w:type="dxa"/>
           </w:tcPr>
           <w:p>
             <w:pPr/>
@@ -3069,7 +3115,7 @@
         </w:tc>
         <w:tc>
           <w:tcPr>
-            <w:tcW w:w="1847" w:type="dxa"/>
+            <w:tcW w:w="1860" w:type="dxa"/>
           </w:tcPr>
           <w:p>
             <w:pPr/>
@@ -3082,7 +3128,7 @@
       <w:tr>
         <w:tc>
           <w:tcPr>
-            <w:tcW w:w="1039" w:type="dxa"/>
+            <w:tcW w:w="1027" w:type="dxa"/>
           </w:tcPr>
           <w:p>
             <w:pPr/>
@@ -3093,7 +3139,7 @@
         </w:tc>
         <w:tc>
           <w:tcPr>
-            <w:tcW w:w="1554" w:type="dxa"/>
+            <w:tcW w:w="1553" w:type="dxa"/>
           </w:tcPr>
           <w:p>
             <w:pPr/>
@@ -3115,7 +3161,7 @@
         </w:tc>
         <w:tc>
           <w:tcPr>
-            <w:tcW w:w="1847" w:type="dxa"/>
+            <w:tcW w:w="1860" w:type="dxa"/>
           </w:tcPr>
           <w:p>
             <w:pPr/>
@@ -3150,7 +3196,7 @@
     <w:p>
       <w:pPr/>
       <w:r>
-        <w:t xml:space="preserve">Firmware must handle two board-specific items:</w:t>
+        <w:t xml:space="preserve">Firmware must handle these board-specific items:</w:t>
       </w:r>
     </w:p>
     <w:p>
@@ -3191,6 +3237,42 @@
     </w:p>
     <w:p>
       <w:pPr>
+        <w:pStyle w:val="ListParagraph"/>
+        <w:numPr>
+          <w:ilvl w:val="0"/>
+          <w:numId w:val="5"/>
+        </w:numPr>
+      </w:pPr>
+      <w:r>
+        <w:t xml:space="preserve">ADC reference: VREF+ is driven by U19 (REF3030, 3.000 V). Leave the internal VREFBUF disabled, as it is after reset (VREFBUF_CSR: ENVR = 0, HIZ = 1); enabling it would fight U19. Scale every ADC, DAC3 and comparator value to 3.0 V full scale. VREFINT is no longer needed for correction, but it makes a useful sanity check on VREF+.</w:t>
+      </w:r>
+    </w:p>
+    <w:p>
+      <w:pPr>
+        <w:pStyle w:val="ListParagraph"/>
+        <w:numPr>
+          <w:ilvl w:val="0"/>
+          <w:numId w:val="5"/>
+        </w:numPr>
+      </w:pPr>
+      <w:r>
+        <w:t xml:space="preserve">VIN monitor: TIM15 in PWM-input mode on PA2, VIN = 50.47 V × (t_high − t_reset) / (period − t_reset) − 0.20 V, t_reset about 20 µs, average 8–16 periods, two-point calibration stored in flash.</w:t>
+      </w:r>
+    </w:p>
+    <w:p>
+      <w:pPr>
+        <w:pStyle w:val="ListParagraph"/>
+        <w:numPr>
+          <w:ilvl w:val="0"/>
+          <w:numId w:val="5"/>
+        </w:numPr>
+      </w:pPr>
+      <w:r>
+        <w:t xml:space="preserve">Input OVP: configure HRTIM1_FLT2 on PA15 active-high so VIN_OVP shuts all HRTIM outputs in hardware.</w:t>
+      </w:r>
+    </w:p>
+    <w:p>
+      <w:pPr>
         <w:pStyle w:val="Heading2"/>
       </w:pPr>
       <w:r>
@@ -3200,7 +3282,7 @@
     <w:p>
       <w:pPr/>
       <w:r>
-        <w:t xml:space="preserve">Every ADC channel uses VREF+ = VDDA = +3V3A (12-bit, 3.3 V nominal). +3V3A comes from the isolator's 3.3 V output through FB1, so its real value sets every absolute full scale below. Measure VDDA at start-up with the internal VREFINT channel (factory value VREFINT_CAL) and scale readings by VDDA / 3.3 V. The NTC and the IL zero are ratiometric and need no correction.</w:t>
+        <w:t xml:space="preserve">Every ADC channel, DAC3 and the comparators use VREF+ = VREF_ADC = 3.000 V from an external REF3030AIDBZR (U19, LCSC C38423). It is ±0.2 % initial, with drift of 50 ppm/°C max (0–70 °C) and 75 ppm/°C max (−40 to 125 °C). U19 runs from +3V3A, and its 50 mV max dropout fits inside the isolator's 3.13 V minimum output. It sources up to 25 mA, so it drives VREF+ (1 µF + 100 nF, C36/C37), the IL zero divider and the NTC pull-up directly, with no buffer. Firmware must keep the internal VREFBUF off (VREFBUF_CSR: ENVR = 0, HIZ = 1). The IL zero (R25/R26) and the NTC pull-up (R29) now hang on VREF_ADC, so those two channels are ratiometric. VDDA (+3V3A) only powers the analog blocks.</w:t>
       </w:r>
     </w:p>
     <w:tbl>
@@ -3213,10 +3295,10 @@
       <w:tblGrid>
         <w:gridCol w:w="1549"/>
         <w:gridCol w:w="1560"/>
-        <w:gridCol w:w="1781"/>
-        <w:gridCol w:w="1847"/>
-        <w:gridCol w:w="1023"/>
-        <w:gridCol w:w="1599"/>
+        <w:gridCol w:w="1939"/>
+        <w:gridCol w:w="1721"/>
+        <w:gridCol w:w="1010"/>
+        <w:gridCol w:w="1580"/>
       </w:tblGrid>
       <w:tr>
         <w:trPr>
@@ -3248,7 +3330,7 @@
         </w:tc>
         <w:tc>
           <w:tcPr>
-            <w:tcW w:w="1781" w:type="dxa"/>
+            <w:tcW w:w="1939" w:type="dxa"/>
             <w:shd w:val="clear" w:color="auto" w:fill="F2F2F2"/>
           </w:tcPr>
           <w:p>
@@ -3260,7 +3342,7 @@
         </w:tc>
         <w:tc>
           <w:tcPr>
-            <w:tcW w:w="1847" w:type="dxa"/>
+            <w:tcW w:w="1721" w:type="dxa"/>
             <w:shd w:val="clear" w:color="auto" w:fill="F2F2F2"/>
           </w:tcPr>
           <w:p>
@@ -3272,7 +3354,7 @@
         </w:tc>
         <w:tc>
           <w:tcPr>
-            <w:tcW w:w="1023" w:type="dxa"/>
+            <w:tcW w:w="1010" w:type="dxa"/>
             <w:shd w:val="clear" w:color="auto" w:fill="F2F2F2"/>
           </w:tcPr>
           <w:p>
@@ -3284,7 +3366,7 @@
         </w:tc>
         <w:tc>
           <w:tcPr>
-            <w:tcW w:w="1599" w:type="dxa"/>
+            <w:tcW w:w="1580" w:type="dxa"/>
             <w:shd w:val="clear" w:color="auto" w:fill="F2F2F2"/>
           </w:tcPr>
           <w:p>
@@ -3320,7 +3402,7 @@
         </w:tc>
         <w:tc>
           <w:tcPr>
-            <w:tcW w:w="1781" w:type="dxa"/>
+            <w:tcW w:w="1939" w:type="dxa"/>
           </w:tcPr>
           <w:p>
             <w:pPr/>
@@ -3331,34 +3413,34 @@
         </w:tc>
         <w:tc>
           <w:tcPr>
-            <w:tcW w:w="1847" w:type="dxa"/>
-          </w:tcPr>
-          <w:p>
-            <w:pPr/>
-            <w:r>
-              <w:t xml:space="preserve">0–68.0 V</w:t>
-            </w:r>
-          </w:p>
-        </w:tc>
-        <w:tc>
-          <w:tcPr>
-            <w:tcW w:w="1023" w:type="dxa"/>
-          </w:tcPr>
-          <w:p>
-            <w:pPr/>
-            <w:r>
-              <w:t xml:space="preserve">16.6 mV</w:t>
-            </w:r>
-          </w:p>
-        </w:tc>
-        <w:tc>
-          <w:tcPr>
-            <w:tcW w:w="1599" w:type="dxa"/>
-          </w:tcPr>
-          <w:p>
-            <w:pPr/>
-            <w:r>
-              <w:t xml:space="preserve">12–48 V = 18–71 % of FS</w:t>
+            <w:tcW w:w="1721" w:type="dxa"/>
+          </w:tcPr>
+          <w:p>
+            <w:pPr/>
+            <w:r>
+              <w:t xml:space="preserve">0–61.8 V</w:t>
+            </w:r>
+          </w:p>
+        </w:tc>
+        <w:tc>
+          <w:tcPr>
+            <w:tcW w:w="1010" w:type="dxa"/>
+          </w:tcPr>
+          <w:p>
+            <w:pPr/>
+            <w:r>
+              <w:t xml:space="preserve">15.1 mV</w:t>
+            </w:r>
+          </w:p>
+        </w:tc>
+        <w:tc>
+          <w:tcPr>
+            <w:tcW w:w="1580" w:type="dxa"/>
+          </w:tcPr>
+          <w:p>
+            <w:pPr/>
+            <w:r>
+              <w:t xml:space="preserve">12–48 V = 19–78 % of FS</w:t>
             </w:r>
           </w:p>
         </w:tc>
@@ -3388,7 +3470,7 @@
         </w:tc>
         <w:tc>
           <w:tcPr>
-            <w:tcW w:w="1781" w:type="dxa"/>
+            <w:tcW w:w="1939" w:type="dxa"/>
           </w:tcPr>
           <w:p>
             <w:pPr/>
@@ -3399,29 +3481,29 @@
         </w:tc>
         <w:tc>
           <w:tcPr>
-            <w:tcW w:w="1847" w:type="dxa"/>
-          </w:tcPr>
-          <w:p>
-            <w:pPr/>
-            <w:r>
-              <w:t xml:space="preserve">0–68.0 V</w:t>
-            </w:r>
-          </w:p>
-        </w:tc>
-        <w:tc>
-          <w:tcPr>
-            <w:tcW w:w="1023" w:type="dxa"/>
-          </w:tcPr>
-          <w:p>
-            <w:pPr/>
-            <w:r>
-              <w:t xml:space="preserve">16.6 mV</w:t>
-            </w:r>
-          </w:p>
-        </w:tc>
-        <w:tc>
-          <w:tcPr>
-            <w:tcW w:w="1599" w:type="dxa"/>
+            <w:tcW w:w="1721" w:type="dxa"/>
+          </w:tcPr>
+          <w:p>
+            <w:pPr/>
+            <w:r>
+              <w:t xml:space="preserve">0–61.8 V</w:t>
+            </w:r>
+          </w:p>
+        </w:tc>
+        <w:tc>
+          <w:tcPr>
+            <w:tcW w:w="1010" w:type="dxa"/>
+          </w:tcPr>
+          <w:p>
+            <w:pPr/>
+            <w:r>
+              <w:t xml:space="preserve">15.1 mV</w:t>
+            </w:r>
+          </w:p>
+        </w:tc>
+        <w:tc>
+          <w:tcPr>
+            <w:tcW w:w="1580" w:type="dxa"/>
           </w:tcPr>
           <w:p>
             <w:pPr/>
@@ -3456,45 +3538,45 @@
         </w:tc>
         <w:tc>
           <w:tcPr>
-            <w:tcW w:w="1781" w:type="dxa"/>
-          </w:tcPr>
-          <w:p>
-            <w:pPr/>
-            <w:r>
-              <w:t xml:space="preserve">4 mΩ × 20 = 80 mV/A, zero at 1.65 V</w:t>
-            </w:r>
-          </w:p>
-        </w:tc>
-        <w:tc>
-          <w:tcPr>
-            <w:tcW w:w="1847" w:type="dxa"/>
-          </w:tcPr>
-          <w:p>
-            <w:pPr/>
-            <w:r>
-              <w:t xml:space="preserve">±20.6 A (about ±20 A usable, INA181 output swing)</w:t>
-            </w:r>
-          </w:p>
-        </w:tc>
-        <w:tc>
-          <w:tcPr>
-            <w:tcW w:w="1023" w:type="dxa"/>
-          </w:tcPr>
-          <w:p>
-            <w:pPr/>
-            <w:r>
-              <w:t xml:space="preserve">10.1 mA</w:t>
-            </w:r>
-          </w:p>
-        </w:tc>
-        <w:tc>
-          <w:tcPr>
-            <w:tcW w:w="1599" w:type="dxa"/>
-          </w:tcPr>
-          <w:p>
-            <w:pPr/>
-            <w:r>
-              <w:t xml:space="preserve">peak 6.2 A = 30 % of FS</w:t>
+            <w:tcW w:w="1939" w:type="dxa"/>
+          </w:tcPr>
+          <w:p>
+            <w:pPr/>
+            <w:r>
+              <w:t xml:space="preserve">4 mΩ × 20 = 80 mV/A, zero at VREF/2 = 1.50 V</w:t>
+            </w:r>
+          </w:p>
+        </w:tc>
+        <w:tc>
+          <w:tcPr>
+            <w:tcW w:w="1721" w:type="dxa"/>
+          </w:tcPr>
+          <w:p>
+            <w:pPr/>
+            <w:r>
+              <w:t xml:space="preserve">±18.75 A (about ±18 A usable, INA181 output swing)</w:t>
+            </w:r>
+          </w:p>
+        </w:tc>
+        <w:tc>
+          <w:tcPr>
+            <w:tcW w:w="1010" w:type="dxa"/>
+          </w:tcPr>
+          <w:p>
+            <w:pPr/>
+            <w:r>
+              <w:t xml:space="preserve">9.2 mA</w:t>
+            </w:r>
+          </w:p>
+        </w:tc>
+        <w:tc>
+          <w:tcPr>
+            <w:tcW w:w="1580" w:type="dxa"/>
+          </w:tcPr>
+          <w:p>
+            <w:pPr/>
+            <w:r>
+              <w:t xml:space="preserve">peak 6.2 A = 33 % of FS</w:t>
             </w:r>
           </w:p>
         </w:tc>
@@ -3524,7 +3606,7 @@
         </w:tc>
         <w:tc>
           <w:tcPr>
-            <w:tcW w:w="1781" w:type="dxa"/>
+            <w:tcW w:w="1939" w:type="dxa"/>
           </w:tcPr>
           <w:p>
             <w:pPr/>
@@ -3535,34 +3617,34 @@
         </w:tc>
         <w:tc>
           <w:tcPr>
-            <w:tcW w:w="1847" w:type="dxa"/>
-          </w:tcPr>
-          <w:p>
-            <w:pPr/>
-            <w:r>
-              <w:t xml:space="preserve">0–6.6 A (about 6.5 A usable)</w:t>
-            </w:r>
-          </w:p>
-        </w:tc>
-        <w:tc>
-          <w:tcPr>
-            <w:tcW w:w="1023" w:type="dxa"/>
-          </w:tcPr>
-          <w:p>
-            <w:pPr/>
-            <w:r>
-              <w:t xml:space="preserve">1.6 mA</w:t>
-            </w:r>
-          </w:p>
-        </w:tc>
-        <w:tc>
-          <w:tcPr>
-            <w:tcW w:w="1599" w:type="dxa"/>
-          </w:tcPr>
-          <w:p>
-            <w:pPr/>
-            <w:r>
-              <w:t xml:space="preserve">5 A = 2.5 V (76 % of FS)</w:t>
+            <w:tcW w:w="1721" w:type="dxa"/>
+          </w:tcPr>
+          <w:p>
+            <w:pPr/>
+            <w:r>
+              <w:t xml:space="preserve">0–6.0 A</w:t>
+            </w:r>
+          </w:p>
+        </w:tc>
+        <w:tc>
+          <w:tcPr>
+            <w:tcW w:w="1010" w:type="dxa"/>
+          </w:tcPr>
+          <w:p>
+            <w:pPr/>
+            <w:r>
+              <w:t xml:space="preserve">1.5 mA</w:t>
+            </w:r>
+          </w:p>
+        </w:tc>
+        <w:tc>
+          <w:tcPr>
+            <w:tcW w:w="1580" w:type="dxa"/>
+          </w:tcPr>
+          <w:p>
+            <w:pPr/>
+            <w:r>
+              <w:t xml:space="preserve">5 A = 2.5 V (83 % of FS)</w:t>
             </w:r>
           </w:p>
         </w:tc>
@@ -3592,29 +3674,29 @@
         </w:tc>
         <w:tc>
           <w:tcPr>
-            <w:tcW w:w="1781" w:type="dxa"/>
-          </w:tcPr>
-          <w:p>
-            <w:pPr/>
-            <w:r>
-              <w:t xml:space="preserve">10k pull-up, 10k B3950 to GND</w:t>
-            </w:r>
-          </w:p>
-        </w:tc>
-        <w:tc>
-          <w:tcPr>
-            <w:tcW w:w="1847" w:type="dxa"/>
-          </w:tcPr>
-          <w:p>
-            <w:pPr/>
-            <w:r>
-              <w:t xml:space="preserve">−40 °C (3.22 V) to 125 °C (0.11 V)</w:t>
-            </w:r>
-          </w:p>
-        </w:tc>
-        <w:tc>
-          <w:tcPr>
-            <w:tcW w:w="1023" w:type="dxa"/>
+            <w:tcW w:w="1939" w:type="dxa"/>
+          </w:tcPr>
+          <w:p>
+            <w:pPr/>
+            <w:r>
+              <w:t xml:space="preserve">10k pull-up from VREF_ADC, 10k B3950 to GND</w:t>
+            </w:r>
+          </w:p>
+        </w:tc>
+        <w:tc>
+          <w:tcPr>
+            <w:tcW w:w="1721" w:type="dxa"/>
+          </w:tcPr>
+          <w:p>
+            <w:pPr/>
+            <w:r>
+              <w:t xml:space="preserve">−40 °C (2.93 V) to 125 °C (0.10 V)</w:t>
+            </w:r>
+          </w:p>
+        </w:tc>
+        <w:tc>
+          <w:tcPr>
+            <w:tcW w:w="1010" w:type="dxa"/>
           </w:tcPr>
           <w:p>
             <w:pPr/>
@@ -3625,12 +3707,12 @@
         </w:tc>
         <w:tc>
           <w:tcPr>
-            <w:tcW w:w="1599" w:type="dxa"/>
-          </w:tcPr>
-          <w:p>
-            <w:pPr/>
-            <w:r>
-              <w:t xml:space="preserve">25 °C = 1.65 V, 100 °C = 0.215 V</w:t>
+            <w:tcW w:w="1580" w:type="dxa"/>
+          </w:tcPr>
+          <w:p>
+            <w:pPr/>
+            <w:r>
+              <w:t xml:space="preserve">25 °C = 1.50 V, 100 °C = 0.195 V</w:t>
             </w:r>
           </w:p>
         </w:tc>
@@ -3660,7 +3742,7 @@
         </w:tc>
         <w:tc>
           <w:tcPr>
-            <w:tcW w:w="1781" w:type="dxa"/>
+            <w:tcW w:w="1939" w:type="dxa"/>
           </w:tcPr>
           <w:p>
             <w:pPr/>
@@ -3671,7 +3753,7 @@
         </w:tc>
         <w:tc>
           <w:tcPr>
-            <w:tcW w:w="1847" w:type="dxa"/>
+            <w:tcW w:w="1721" w:type="dxa"/>
           </w:tcPr>
           <w:p>
             <w:pPr/>
@@ -3682,7 +3764,7 @@
         </w:tc>
         <w:tc>
           <w:tcPr>
-            <w:tcW w:w="1023" w:type="dxa"/>
+            <w:tcW w:w="1010" w:type="dxa"/>
           </w:tcPr>
           <w:p>
             <w:pPr/>
@@ -3693,7 +3775,7 @@
         </w:tc>
         <w:tc>
           <w:tcPr>
-            <w:tcW w:w="1599" w:type="dxa"/>
+            <w:tcW w:w="1580" w:type="dxa"/>
           </w:tcPr>
           <w:p>
             <w:pPr/>
@@ -3728,7 +3810,7 @@
         </w:tc>
         <w:tc>
           <w:tcPr>
-            <w:tcW w:w="1781" w:type="dxa"/>
+            <w:tcW w:w="1939" w:type="dxa"/>
           </w:tcPr>
           <w:p>
             <w:pPr/>
@@ -3739,7 +3821,7 @@
         </w:tc>
         <w:tc>
           <w:tcPr>
-            <w:tcW w:w="1847" w:type="dxa"/>
+            <w:tcW w:w="1721" w:type="dxa"/>
           </w:tcPr>
           <w:p>
             <w:pPr/>
@@ -3750,7 +3832,7 @@
         </w:tc>
         <w:tc>
           <w:tcPr>
-            <w:tcW w:w="1023" w:type="dxa"/>
+            <w:tcW w:w="1010" w:type="dxa"/>
           </w:tcPr>
           <w:p>
             <w:pPr/>
@@ -3761,7 +3843,7 @@
         </w:tc>
         <w:tc>
           <w:tcPr>
-            <w:tcW w:w="1599" w:type="dxa"/>
+            <w:tcW w:w="1580" w:type="dxa"/>
           </w:tcPr>
           <w:p>
             <w:pPr/>
@@ -3796,40 +3878,40 @@
         </w:tc>
         <w:tc>
           <w:tcPr>
-            <w:tcW w:w="1781" w:type="dxa"/>
-          </w:tcPr>
-          <w:p>
-            <w:pPr/>
-            <w:r>
-              <w:t xml:space="preserve">12-bit, 0–3.3 V</w:t>
-            </w:r>
-          </w:p>
-        </w:tc>
-        <w:tc>
-          <w:tcPr>
-            <w:tcW w:w="1847" w:type="dxa"/>
-          </w:tcPr>
-          <w:p>
-            <w:pPr/>
-            <w:r>
-              <w:t xml:space="preserve">IL ±20.6 A, VOUT 0–68 V</w:t>
-            </w:r>
-          </w:p>
-        </w:tc>
-        <w:tc>
-          <w:tcPr>
-            <w:tcW w:w="1023" w:type="dxa"/>
-          </w:tcPr>
-          <w:p>
-            <w:pPr/>
-            <w:r>
-              <w:t xml:space="preserve">10 mA, 16.6 mV</w:t>
-            </w:r>
-          </w:p>
-        </w:tc>
-        <w:tc>
-          <w:tcPr>
-            <w:tcW w:w="1599" w:type="dxa"/>
+            <w:tcW w:w="1939" w:type="dxa"/>
+          </w:tcPr>
+          <w:p>
+            <w:pPr/>
+            <w:r>
+              <w:t xml:space="preserve">12-bit, 0–3.0 V</w:t>
+            </w:r>
+          </w:p>
+        </w:tc>
+        <w:tc>
+          <w:tcPr>
+            <w:tcW w:w="1721" w:type="dxa"/>
+          </w:tcPr>
+          <w:p>
+            <w:pPr/>
+            <w:r>
+              <w:t xml:space="preserve">IL ±18.75 A, VOUT 0–61.8 V</w:t>
+            </w:r>
+          </w:p>
+        </w:tc>
+        <w:tc>
+          <w:tcPr>
+            <w:tcW w:w="1010" w:type="dxa"/>
+          </w:tcPr>
+          <w:p>
+            <w:pPr/>
+            <w:r>
+              <w:t xml:space="preserve">9.2 mA, 15.1 mV</w:t>
+            </w:r>
+          </w:p>
+        </w:tc>
+        <w:tc>
+          <w:tcPr>
+            <w:tcW w:w="1580" w:type="dxa"/>
           </w:tcPr>
           <w:p>
             <w:pPr/>
@@ -3843,7 +3925,7 @@
     <w:p>
       <w:pPr/>
       <w:r>
-        <w:t xml:space="preserve">Error budget, untrimmed: about ±0.3 % for the VBUS and VOUT dividers (0.1 % resistors plus ADC) once VDDA is corrected with VREFINT. IL and IOUT are about ±1.5 % (INA181 gain ±1 %, 1 % shunts) plus offset, so zero both at start-up with the power stage off. VIN is about ±1.5 %, or about ±0.5 % after a two-point calibration.</w:t>
+        <w:t xml:space="preserve">Error budget, untrimmed: VBUS and VOUT about ±0.3 % (REF3030 ±0.2 %, 0.1 % dividers, ADC), plus up to about ±0.35 % from reference drift over 0–70 °C. IL and IOUT are about ±1.5 % (INA181 gain ±1 %, 1 % shunts) plus offset, so zero both at start-up with the power stage off. A one-point calibration of VBUS/VOUT at room temperature leaves only the drift term. VIN is about ±1.5 %, or about ±0.5 % after a two-point calibration (separate TL431 reference on the primary side).</w:t>
       </w:r>
     </w:p>
     <w:p>
@@ -4931,7 +5013,7 @@
     <w:p>
       <w:pPr/>
       <w:r>
-        <w:t xml:space="preserve">The estimated BOM is about $36.34 per board at 100 pcs: 225 placed parts on 89 lines, excluding PCB and assembly. The isolation stage (LLC, isolator, primary aux, OVP and VIN monitor) adds about $13.02, which is 55% over the $23.42 non-isolated design. That misses the 20% premium target.</w:t>
+        <w:t xml:space="preserve">The estimated BOM is about $36.85 per board at 100 pcs: 227 placed parts on 90 lines, excluding PCB and assembly. The isolation stage (LLC, isolator, primary aux, OVP and VIN monitor) adds about $13.02, which is 54% over the $23.92 non-isolated design (which now includes the $0.50 REF3030 ADC reference). That misses the 20% premium target.</w:t>
       </w:r>
     </w:p>
     <w:tbl>
@@ -5377,10 +5459,10 @@
         <w:tblLook w:val="04A0" w:firstRow="1" w:lastRow="0" w:firstColumn="0" w:lastColumn="0" w:noHBand="0" w:noVBand="1"/>
       </w:tblPr>
       <w:tblGrid>
-        <w:gridCol w:w="2794"/>
-        <w:gridCol w:w="1398"/>
-        <w:gridCol w:w="1430"/>
-        <w:gridCol w:w="3738"/>
+        <w:gridCol w:w="2903"/>
+        <w:gridCol w:w="1357"/>
+        <w:gridCol w:w="1319"/>
+        <w:gridCol w:w="3780"/>
       </w:tblGrid>
       <w:tr>
         <w:trPr>
@@ -5388,7 +5470,7 @@
         </w:trPr>
         <w:tc>
           <w:tcPr>
-            <w:tcW w:w="2794" w:type="dxa"/>
+            <w:tcW w:w="2903" w:type="dxa"/>
             <w:shd w:val="clear" w:color="auto" w:fill="F2F2F2"/>
           </w:tcPr>
           <w:p>
@@ -5400,7 +5482,7 @@
         </w:tc>
         <w:tc>
           <w:tcPr>
-            <w:tcW w:w="1398" w:type="dxa"/>
+            <w:tcW w:w="1357" w:type="dxa"/>
             <w:shd w:val="clear" w:color="auto" w:fill="F2F2F2"/>
           </w:tcPr>
           <w:p>
@@ -5412,7 +5494,7 @@
         </w:tc>
         <w:tc>
           <w:tcPr>
-            <w:tcW w:w="1430" w:type="dxa"/>
+            <w:tcW w:w="1319" w:type="dxa"/>
             <w:shd w:val="clear" w:color="auto" w:fill="F2F2F2"/>
           </w:tcPr>
           <w:p>
@@ -5424,7 +5506,7 @@
         </w:tc>
         <w:tc>
           <w:tcPr>
-            <w:tcW w:w="3738" w:type="dxa"/>
+            <w:tcW w:w="3780" w:type="dxa"/>
             <w:shd w:val="clear" w:color="auto" w:fill="F2F2F2"/>
           </w:tcPr>
           <w:p>
@@ -5438,7 +5520,7 @@
       <w:tr>
         <w:tc>
           <w:tcPr>
-            <w:tcW w:w="2794" w:type="dxa"/>
+            <w:tcW w:w="2903" w:type="dxa"/>
           </w:tcPr>
           <w:p>
             <w:pPr/>
@@ -5454,7 +5536,7 @@
         </w:tc>
         <w:tc>
           <w:tcPr>
-            <w:tcW w:w="1398" w:type="dxa"/>
+            <w:tcW w:w="1357" w:type="dxa"/>
           </w:tcPr>
           <w:p>
             <w:pPr/>
@@ -5465,7 +5547,7 @@
         </w:tc>
         <w:tc>
           <w:tcPr>
-            <w:tcW w:w="1430" w:type="dxa"/>
+            <w:tcW w:w="1319" w:type="dxa"/>
           </w:tcPr>
           <w:p>
             <w:pPr/>
@@ -5476,7 +5558,7 @@
         </w:tc>
         <w:tc>
           <w:tcPr>
-            <w:tcW w:w="3738" w:type="dxa"/>
+            <w:tcW w:w="3780" w:type="dxa"/>
           </w:tcPr>
           <w:p>
             <w:pPr/>
@@ -5500,7 +5582,7 @@
       <w:tr>
         <w:tc>
           <w:tcPr>
-            <w:tcW w:w="2794" w:type="dxa"/>
+            <w:tcW w:w="2903" w:type="dxa"/>
           </w:tcPr>
           <w:p>
             <w:pPr/>
@@ -5516,7 +5598,7 @@
         </w:tc>
         <w:tc>
           <w:tcPr>
-            <w:tcW w:w="1398" w:type="dxa"/>
+            <w:tcW w:w="1357" w:type="dxa"/>
           </w:tcPr>
           <w:p>
             <w:pPr/>
@@ -5527,7 +5609,7 @@
         </w:tc>
         <w:tc>
           <w:tcPr>
-            <w:tcW w:w="1430" w:type="dxa"/>
+            <w:tcW w:w="1319" w:type="dxa"/>
           </w:tcPr>
           <w:p>
             <w:pPr/>
@@ -5538,7 +5620,7 @@
         </w:tc>
         <w:tc>
           <w:tcPr>
-            <w:tcW w:w="3738" w:type="dxa"/>
+            <w:tcW w:w="3780" w:type="dxa"/>
           </w:tcPr>
           <w:p>
             <w:pPr/>
@@ -5551,7 +5633,7 @@
       <w:tr>
         <w:tc>
           <w:tcPr>
-            <w:tcW w:w="2794" w:type="dxa"/>
+            <w:tcW w:w="2903" w:type="dxa"/>
           </w:tcPr>
           <w:p>
             <w:pPr/>
@@ -5570,7 +5652,7 @@
         </w:tc>
         <w:tc>
           <w:tcPr>
-            <w:tcW w:w="1398" w:type="dxa"/>
+            <w:tcW w:w="1357" w:type="dxa"/>
           </w:tcPr>
           <w:p>
             <w:pPr/>
@@ -5581,7 +5663,7 @@
         </w:tc>
         <w:tc>
           <w:tcPr>
-            <w:tcW w:w="1430" w:type="dxa"/>
+            <w:tcW w:w="1319" w:type="dxa"/>
           </w:tcPr>
           <w:p>
             <w:pPr/>
@@ -5592,7 +5674,7 @@
         </w:tc>
         <w:tc>
           <w:tcPr>
-            <w:tcW w:w="3738" w:type="dxa"/>
+            <w:tcW w:w="3780" w:type="dxa"/>
           </w:tcPr>
           <w:p>
             <w:pPr/>
@@ -5616,7 +5698,7 @@
       <w:tr>
         <w:tc>
           <w:tcPr>
-            <w:tcW w:w="2794" w:type="dxa"/>
+            <w:tcW w:w="2903" w:type="dxa"/>
           </w:tcPr>
           <w:p>
             <w:pPr/>
@@ -5632,7 +5714,7 @@
         </w:tc>
         <w:tc>
           <w:tcPr>
-            <w:tcW w:w="1398" w:type="dxa"/>
+            <w:tcW w:w="1357" w:type="dxa"/>
           </w:tcPr>
           <w:p>
             <w:pPr/>
@@ -5643,7 +5725,7 @@
         </w:tc>
         <w:tc>
           <w:tcPr>
-            <w:tcW w:w="1430" w:type="dxa"/>
+            <w:tcW w:w="1319" w:type="dxa"/>
           </w:tcPr>
           <w:p>
             <w:pPr/>
@@ -5654,7 +5736,7 @@
         </w:tc>
         <w:tc>
           <w:tcPr>
-            <w:tcW w:w="3738" w:type="dxa"/>
+            <w:tcW w:w="3780" w:type="dxa"/>
           </w:tcPr>
           <w:p>
             <w:pPr/>
@@ -5667,7 +5749,7 @@
       <w:tr>
         <w:tc>
           <w:tcPr>
-            <w:tcW w:w="2794" w:type="dxa"/>
+            <w:tcW w:w="2903" w:type="dxa"/>
           </w:tcPr>
           <w:p>
             <w:pPr/>
@@ -5686,7 +5768,7 @@
         </w:tc>
         <w:tc>
           <w:tcPr>
-            <w:tcW w:w="1398" w:type="dxa"/>
+            <w:tcW w:w="1357" w:type="dxa"/>
           </w:tcPr>
           <w:p>
             <w:pPr/>
@@ -5697,7 +5779,7 @@
         </w:tc>
         <w:tc>
           <w:tcPr>
-            <w:tcW w:w="1430" w:type="dxa"/>
+            <w:tcW w:w="1319" w:type="dxa"/>
           </w:tcPr>
           <w:p>
             <w:pPr/>
@@ -5708,7 +5790,7 @@
         </w:tc>
         <w:tc>
           <w:tcPr>
-            <w:tcW w:w="3738" w:type="dxa"/>
+            <w:tcW w:w="3780" w:type="dxa"/>
           </w:tcPr>
           <w:p>
             <w:pPr/>
@@ -5721,7 +5803,7 @@
       <w:tr>
         <w:tc>
           <w:tcPr>
-            <w:tcW w:w="2794" w:type="dxa"/>
+            <w:tcW w:w="2903" w:type="dxa"/>
           </w:tcPr>
           <w:p>
             <w:pPr/>
@@ -5740,7 +5822,7 @@
         </w:tc>
         <w:tc>
           <w:tcPr>
-            <w:tcW w:w="1398" w:type="dxa"/>
+            <w:tcW w:w="1357" w:type="dxa"/>
           </w:tcPr>
           <w:p>
             <w:pPr/>
@@ -5751,7 +5833,7 @@
         </w:tc>
         <w:tc>
           <w:tcPr>
-            <w:tcW w:w="1430" w:type="dxa"/>
+            <w:tcW w:w="1319" w:type="dxa"/>
           </w:tcPr>
           <w:p>
             <w:pPr/>
@@ -5762,7 +5844,7 @@
         </w:tc>
         <w:tc>
           <w:tcPr>
-            <w:tcW w:w="3738" w:type="dxa"/>
+            <w:tcW w:w="3780" w:type="dxa"/>
           </w:tcPr>
           <w:p>
             <w:pPr/>
@@ -5775,7 +5857,7 @@
       <w:tr>
         <w:tc>
           <w:tcPr>
-            <w:tcW w:w="2794" w:type="dxa"/>
+            <w:tcW w:w="2903" w:type="dxa"/>
           </w:tcPr>
           <w:p>
             <w:pPr/>
@@ -5794,7 +5876,7 @@
         </w:tc>
         <w:tc>
           <w:tcPr>
-            <w:tcW w:w="1398" w:type="dxa"/>
+            <w:tcW w:w="1357" w:type="dxa"/>
           </w:tcPr>
           <w:p>
             <w:pPr/>
@@ -5805,7 +5887,7 @@
         </w:tc>
         <w:tc>
           <w:tcPr>
-            <w:tcW w:w="1430" w:type="dxa"/>
+            <w:tcW w:w="1319" w:type="dxa"/>
           </w:tcPr>
           <w:p>
             <w:pPr/>
@@ -5816,7 +5898,7 @@
         </w:tc>
         <w:tc>
           <w:tcPr>
-            <w:tcW w:w="3738" w:type="dxa"/>
+            <w:tcW w:w="3780" w:type="dxa"/>
           </w:tcPr>
           <w:p>
             <w:pPr/>
@@ -5829,7 +5911,7 @@
       <w:tr>
         <w:tc>
           <w:tcPr>
-            <w:tcW w:w="2794" w:type="dxa"/>
+            <w:tcW w:w="2903" w:type="dxa"/>
           </w:tcPr>
           <w:p>
             <w:pPr/>
@@ -5845,7 +5927,7 @@
         </w:tc>
         <w:tc>
           <w:tcPr>
-            <w:tcW w:w="1398" w:type="dxa"/>
+            <w:tcW w:w="1357" w:type="dxa"/>
           </w:tcPr>
           <w:p>
             <w:pPr/>
@@ -5856,7 +5938,7 @@
         </w:tc>
         <w:tc>
           <w:tcPr>
-            <w:tcW w:w="1430" w:type="dxa"/>
+            <w:tcW w:w="1319" w:type="dxa"/>
           </w:tcPr>
           <w:p>
             <w:pPr/>
@@ -5867,7 +5949,7 @@
         </w:tc>
         <w:tc>
           <w:tcPr>
-            <w:tcW w:w="3738" w:type="dxa"/>
+            <w:tcW w:w="3780" w:type="dxa"/>
           </w:tcPr>
           <w:p>
             <w:pPr/>
@@ -5880,7 +5962,7 @@
       <w:tr>
         <w:tc>
           <w:tcPr>
-            <w:tcW w:w="2794" w:type="dxa"/>
+            <w:tcW w:w="2903" w:type="dxa"/>
           </w:tcPr>
           <w:p>
             <w:pPr/>
@@ -5907,7 +5989,7 @@
         </w:tc>
         <w:tc>
           <w:tcPr>
-            <w:tcW w:w="1398" w:type="dxa"/>
+            <w:tcW w:w="1357" w:type="dxa"/>
           </w:tcPr>
           <w:p>
             <w:pPr/>
@@ -5918,7 +6000,7 @@
         </w:tc>
         <w:tc>
           <w:tcPr>
-            <w:tcW w:w="1430" w:type="dxa"/>
+            <w:tcW w:w="1319" w:type="dxa"/>
           </w:tcPr>
           <w:p>
             <w:pPr/>
@@ -5929,7 +6011,7 @@
         </w:tc>
         <w:tc>
           <w:tcPr>
-            <w:tcW w:w="3738" w:type="dxa"/>
+            <w:tcW w:w="3780" w:type="dxa"/>
           </w:tcPr>
           <w:p>
             <w:pPr/>
@@ -5939,6 +6021,52 @@
           </w:p>
         </w:tc>
       </w:tr>
+      <w:tr>
+        <w:tc>
+          <w:tcPr>
+            <w:tcW w:w="2903" w:type="dxa"/>
+          </w:tcPr>
+          <w:p>
+            <w:pPr/>
+            <w:r>
+              <w:t xml:space="preserve">REF3030AIDBZR (ADC reference)</w:t>
+            </w:r>
+          </w:p>
+        </w:tc>
+        <w:tc>
+          <w:tcPr>
+            <w:tcW w:w="1357" w:type="dxa"/>
+          </w:tcPr>
+          <w:p>
+            <w:pPr/>
+            <w:r>
+              <w:t xml:space="preserve">C38423</w:t>
+            </w:r>
+          </w:p>
+        </w:tc>
+        <w:tc>
+          <w:tcPr>
+            <w:tcW w:w="1319" w:type="dxa"/>
+          </w:tcPr>
+          <w:p>
+            <w:pPr/>
+            <w:r>
+              <w:t xml:space="preserve">about $0.50 (estimate)</w:t>
+            </w:r>
+          </w:p>
+        </w:tc>
+        <w:tc>
+          <w:tcPr>
+            <w:tcW w:w="3780" w:type="dxa"/>
+          </w:tcPr>
+          <w:p>
+            <w:pPr/>
+            <w:r>
+              <w:t xml:space="preserve">Not checked; confirm before ordering</w:t>
+            </w:r>
+          </w:p>
+        </w:tc>
+      </w:tr>
     </w:tbl>
     <w:p>
       <w:pPr/>
@@ -5957,7 +6085,7 @@
     <w:p>
       <w:pPr/>
       <w:r>
-        <w:t xml:space="preserve">The board is 160 x 105 mm, 4 layers, with 255 footprints, 1,805 track segments and 751 vias (after the 18 Oct clean-up and the VIN monitor). It is fully routed and KiCad DRC reports 0 errors, 0 unconnected pads and 0 silkscreen warnings. The only other DRC lines are 199 "footprint differs from library" notices. They appear because the standard KiCad libraries are not installed where the check ran, and they do not affect the board.</w:t>
+        <w:t xml:space="preserve">The board is 160 x 105 mm, 4 layers, with 257 footprints, 1,882 track segments and 761 vias (after the 18 Oct clean-up, the VIN monitor and the REF3030 ADC reference). It is fully routed and KiCad DRC reports 0 errors, 0 unconnected pads and 0 silkscreen warnings. The only other DRC lines are 199 "footprint differs from library" notices. They appear because the standard KiCad libraries are not installed where the check ran, and they do not affect the board.</w:t>
       </w:r>
     </w:p>
     <w:tbl>
@@ -6340,7 +6468,7 @@
         </w:numPr>
       </w:pPr>
       <w:r>
-        <w:t xml:space="preserve">Silkscreen: references are 0.8 mm and moved clear of pads and other silk. Only C67 has its reference on the assembly (Fab) layer alone.</w:t>
+        <w:t xml:space="preserve">Silkscreen: references are 0.8 mm and moved clear of pads and other silk. C2–C4 (VBUS ceramics at the SR) and C67 (HBP bootstrap) are too crowded for a reference, so theirs are hidden and shown only on the assembly (Fab) layer.</w:t>
       </w:r>
     </w:p>
     <w:p>
@@ -6353,6 +6481,30 @@
       </w:pPr>
       <w:r>
         <w:t xml:space="preserve">Optional: a milled slot in the primary/secondary band, between T1 and U12, if your standard needs more creepage.</w:t>
+      </w:r>
+    </w:p>
+    <w:p>
+      <w:pPr>
+        <w:pStyle w:val="ListParagraph"/>
+        <w:numPr>
+          <w:ilvl w:val="0"/>
+          <w:numId w:val="9"/>
+        </w:numPr>
+      </w:pPr>
+      <w:r>
+        <w:t xml:space="preserve">ADC reference: on the first board, check VREF+ with a scope while the ADC is converting. The REF30 datasheet asks for care with large low-ESR ceramics on its output; if VREF+ rings, put 1–2 Ω in series with C36.</w:t>
+      </w:r>
+    </w:p>
+    <w:p>
+      <w:pPr>
+        <w:pStyle w:val="ListParagraph"/>
+        <w:numPr>
+          <w:ilvl w:val="0"/>
+          <w:numId w:val="9"/>
+        </w:numPr>
+      </w:pPr>
+      <w:r>
+        <w:t xml:space="preserve">Confirm the CA-IS3642 3.3 V output stays at or above about 3.08 V at full load and temperature, which is the REF3030's 3.000 V plus its 50 mV maximum dropout plus the FB1 drop. The minimum you quoted, about 3.13 V, leaves roughly 80 mV of margin.</w:t>
       </w:r>
     </w:p>
     <w:p>

</xml_diff>

<commit_message>
Comply with JLCPCB 4-layer capabilities (2 oz outer)
- PTH pad to track >= 0.28 mm: J5 ADDR_H3 (F.Cu) and ADDR_H2 (In2) re-routed,
  J3/J4 CAN In2 runs 0.4 mm, unused inner annular rings removed on J3/J4/J5
- Silkscreen: all text >= 1.0 mm high, 0.15 mm stroke; only 2 references moved
- New kicad_dru with the JLC limits as custom DRC rules; DRC 0 errors / 0
  warnings with them loaded, parity OK, isolation 4.0 mm
- Gerbers, CPL, PCB PDF, EasyEDA zip, design notes and README updated

Co-Authored-By: Claude Opus 5.5 <noreply@anthropic.com>
Claude-Session: https://claude.ai/code/session_01A35wrnwFKLPSaRSxxHs471
</commit_message>
<xml_diff>
--- a/01_hardware/docs/DCDC_Design_Notes.docx
+++ b/01_hardware/docs/DCDC_Design_Notes.docx
@@ -6085,7 +6085,7 @@
     <w:p>
       <w:pPr/>
       <w:r>
-        <w:t xml:space="preserve">The board is 160 x 105 mm, 4 layers, with 257 footprints, 1,882 track segments and 761 vias (after the 18 Oct clean-up, the VIN monitor and the REF3030 ADC reference). It is fully routed and KiCad DRC reports 0 errors, 0 unconnected pads and 0 silkscreen warnings. The only other DRC lines are 199 "footprint differs from library" notices. They appear because the standard KiCad libraries are not installed where the check ran, and they do not affect the board.</w:t>
+        <w:t xml:space="preserve">The board is 160 x 105 mm, 4 layers, with 257 footprints, 1,881 track segments and 761 vias (after the 18 Oct clean-up, the VIN monitor and the REF3030 ADC reference). It meets JLCPCB's 4-layer capabilities with 2 oz outer copper: trace/space 0.15/0.2 mm, vias 0.6/0.3 mm, PTH annular ring 0.34 mm or more, PTH pad to track 0.28 mm or more, hole to inner copper 0.3 mm or more, copper to edge 0.5 mm, mask bridge 0.2 mm, silkscreen text 1.0 mm / 0.15 mm. These limits are in the project as custom DRC rules (DCDC_LLC_4SBB_G474.kicad_dru), so KiCad flags any later edit that breaks them. It is fully routed and KiCad DRC reports 0 errors, 0 unconnected pads and 0 silkscreen warnings. The only other DRC lines are 199 "footprint differs from library" notices. They appear because the standard KiCad libraries are not installed where the check ran, and they do not affect the board.</w:t>
       </w:r>
     </w:p>
     <w:tbl>
@@ -6468,7 +6468,7 @@
         </w:numPr>
       </w:pPr>
       <w:r>
-        <w:t xml:space="preserve">Silkscreen: references are 0.8 mm and moved clear of pads and other silk. C2–C4 (VBUS ceramics at the SR) and C67 (HBP bootstrap) are too crowded for a reference, so theirs are hidden and shown only on the assembly (Fab) layer.</w:t>
+        <w:t xml:space="preserve">Silkscreen: all text is at least 1.0 mm high with a 0.15 mm stroke (JLCPCB minimum), clear of pads and other silk. C2–C4 (VBUS ceramics at the SR) and C67 (HBP bootstrap) are too crowded for a reference, so theirs are hidden and shown only on the assembly (Fab) layer.</w:t>
       </w:r>
     </w:p>
     <w:p>

</xml_diff>

<commit_message>
Rev E BOM: in-stock LCSC first source for every part; 2nd/3rd sources checked
- First sources swapped (same footprints, layout unchanged): U1 STM32G474RBT3,
  Q2/Q3/Q5/Q6 NCEP068N10G, 10k 0402 FOJAN, 100n 0402 merged onto C307331,
  1u 0402 CCTC, R62/R63/R89/R82, FB1 Murata BLM18KG601SN1D, L2/L3 cjiang
  FNR5040S470MT, C82 KEMET C0G (was X7R), RS1 Milliohm HoJLR2512, SS110 MDD
- LCSC part numbers for the hand-soldered headers (J1-J5, J7, JP1)
- Schematic and PCB fields, BOM, JLC BOM/CPL, PDFs and design notes regenerated;
  netlist check 0 errors, DRC unchanged
- BOM_sourcing_revE.xlsx: live LCSC stock 2026-10-20, 2nd/3rd sources checked
  for pinout / land pattern / ratings, PCB reserve options for T2 and U9

Co-Authored-By: Claude Opus 5.5 <noreply@anthropic.com>
Claude-Session: https://claude.ai/code/session_01A35wrnwFKLPSaRSxxHs471
</commit_message>
<xml_diff>
--- a/01_hardware/docs/DCDC_Design_Notes.docx
+++ b/01_hardware/docs/DCDC_Design_Notes.docx
@@ -248,7 +248,7 @@
           <w:p>
             <w:pPr/>
             <w:r>
-              <w:t xml:space="preserve">STM32G474RBT6</w:t>
+              <w:t xml:space="preserve">STM32G474RBT3</w:t>
             </w:r>
           </w:p>
         </w:tc>
@@ -433,6 +433,18 @@
       </w:r>
       <w:r>
         <w:t xml:space="preserve"> F1 is now a 1206 chip fuse, 7 A / 63 V (Littelfuse 0458007.DR, LCSC C206980; second source Schurter 3413.0326.11). L2 and L3 now use the common 5040 shielded footprint: SWPA5040S470MT, 47 uH, 1.1 A (LCSC C86617; second sources Bourns SRN5040-470M, Taiyo Yuden NRS5040T470MMGK). EN_AUX was re-routed off the path between the L2 pads, and the VIN track at L3 now runs centred between the pads (0.4 mm each side). Every assembled part now carries an LCSC number checked against JLCPCB stock; the assembly upload files are DCDC_JLC_BOM.csv and DCDC_JLC_CPL.csv (217 parts). U1 (own sample), T1, J1-J5, J7, JP1 and SW1 are hand-soldered.</w:t>
+      </w:r>
+    </w:p>
+    <w:p>
+      <w:pPr/>
+      <w:r>
+        <w:rPr>
+          <w:b/>
+        </w:rPr>
+        <w:t xml:space="preserve">Order prep (20 Oct):</w:t>
+      </w:r>
+      <w:r>
+        <w:t xml:space="preserve"> every part now has an in-stock LCSC first source (live LCSC stock, 20 Oct), same footprints, no layout change. Swapped: U1 STM32G474RBT3 (C1235414), Q2/Q3/Q5/Q6 NCEP068N10G (C503061), 51 x 10k FOJAN (C2906861), 22 x 100 nF onto C307331, 1 uF 0402 CCTC (C20539426), R62/R63 2R2 (C2907006), R89 22R (C2929994), R82 10k 0.1 % Vishay (C844452), FB1 Murata BLM18KG601SN1D (C85833), L2/L3 cjiang FNR5040S470MT (C167974), C82 KEMET C0G 47 nF (C2233314; the old part was X7R), RS1 Milliohm HoJLR2512-3W-4mR (C2904236), SS110 x4 MDD (C2482). Hand-soldered headers: J1/J2 KF2EDGR-5.08-2P (C441204, plugs KF2EDGK-5.08-2P-AA C440880), J3/J4 C42419910, J5 C42419913, JP1 C45384660, J7 C41376037. T1 (custom PQ2620) is the only part not on LCSC. Second and third sources, checked for pinout and land pattern: 01_hardware/bom/BOM_sourcing_revE.xlsx.</w:t>
       </w:r>
     </w:p>
     <w:p>
@@ -470,7 +482,7 @@
         </w:numPr>
       </w:pPr>
       <w:r>
-        <w:t xml:space="preserve">Primary: VIN -&gt; half-bridge (Q5/Q6, NCEP0160AG) -&gt; split resonant capacitors (2 x 300 nF C0G) -&gt; PQ2620 primary. Lr is the transformer leakage, 1.0 uH.</w:t>
+        <w:t xml:space="preserve">Primary: VIN -&gt; half-bridge (Q5/Q6, NCEP068N10G) -&gt; split resonant capacitors (2 x 300 nF C0G) -&gt; PQ2620 primary. Lr is the transformer leakage, 1.0 uH.</w:t>
       </w:r>
     </w:p>
     <w:p>
@@ -1237,7 +1249,7 @@
     <w:p>
       <w:pPr/>
       <w:r>
-        <w:t xml:space="preserve">FET choice follows what each switch does. Q1 and Q4 hard-switch, so they use the low-Qgd NCEP0140AG (100 V, 23 mOhm max, Qgd 3.8 nC). Q2 and Q3 carry the full 5 A in buck mode as synchronous rectifier and static-on switch, so they use the low-Rds NCEP0160AG (100 V, 8.5 mOhm max).</w:t>
+        <w:t xml:space="preserve">FET choice follows what each switch does. Q1 and Q4 hard-switch, so they use the low-Qgd NCEP0140AG (100 V, 23 mOhm max, Qgd 3.8 nC). Q2 and Q3 carry the full 5 A in buck mode as synchronous rectifier and static-on switch, so they use the low-Rds NCEP068N10G (100 V, 6.1 mOhm, Qg 60 nC; replaced NCEP0160AG on 20 Oct, which was down to 38 pcs).</w:t>
       </w:r>
     </w:p>
     <w:tbl>
@@ -2082,7 +2094,7 @@
     <w:p>
       <w:pPr/>
       <w:r>
-        <w:t xml:space="preserve">Total loss includes 0.7 W housekeeping (MCU, CAN, aux supplies), which is why 1.5 V / 7.5 W shows 68%. Model assumptions: Rds at 1.4x the 25 C max, 8 ns V-I overlap per hard edge, 30 ns dead time, Qrr 50-80 nC (not listed for NCEP0160AG, so assumed), inductor DCR 25 mOhm.</w:t>
+        <w:t xml:space="preserve">Total loss includes 0.7 W housekeeping (MCU, CAN, aux supplies), which is why 1.5 V / 7.5 W shows 68%. Model assumptions: Rds at 1.4x the 25 C max, 8 ns V-I overlap per hard edge, 30 ns dead time, Qrr 50-80 nC (not listed for the NCE parts, so assumed), inductor DCR 25 mOhm.</w:t>
       </w:r>
     </w:p>
     <w:p>
@@ -5333,7 +5345,7 @@
           <w:p>
             <w:pPr/>
             <w:r>
-              <w:t xml:space="preserve">NCEP0160AG primary FET (C503012)</w:t>
+              <w:t xml:space="preserve">NCEP068N10G primary FET (C503061)</w:t>
             </w:r>
           </w:p>
         </w:tc>
@@ -5559,10 +5571,10 @@
         <w:tblLook w:val="04A0" w:firstRow="1" w:lastRow="0" w:firstColumn="0" w:lastColumn="0" w:noHBand="0" w:noVBand="1"/>
       </w:tblPr>
       <w:tblGrid>
-        <w:gridCol w:w="2667"/>
+        <w:gridCol w:w="2639"/>
         <w:gridCol w:w="1344"/>
-        <w:gridCol w:w="1312"/>
-        <w:gridCol w:w="4037"/>
+        <w:gridCol w:w="1430"/>
+        <w:gridCol w:w="3947"/>
       </w:tblGrid>
       <w:tr>
         <w:trPr>
@@ -5570,7 +5582,7 @@
         </w:trPr>
         <w:tc>
           <w:tcPr>
-            <w:tcW w:w="2667" w:type="dxa"/>
+            <w:tcW w:w="2639" w:type="dxa"/>
             <w:shd w:val="clear" w:color="auto" w:fill="F2F2F2"/>
           </w:tcPr>
           <w:p>
@@ -5594,7 +5606,7 @@
         </w:tc>
         <w:tc>
           <w:tcPr>
-            <w:tcW w:w="1312" w:type="dxa"/>
+            <w:tcW w:w="1430" w:type="dxa"/>
             <w:shd w:val="clear" w:color="auto" w:fill="F2F2F2"/>
           </w:tcPr>
           <w:p>
@@ -5606,21 +5618,21 @@
         </w:tc>
         <w:tc>
           <w:tcPr>
-            <w:tcW w:w="4037" w:type="dxa"/>
+            <w:tcW w:w="3947" w:type="dxa"/>
             <w:shd w:val="clear" w:color="auto" w:fill="F2F2F2"/>
           </w:tcPr>
           <w:p>
             <w:pPr/>
             <w:r>
-              <w:t xml:space="preserve">Stock (2026-10-18, JLCPCB)</w:t>
-            </w:r>
-          </w:p>
-        </w:tc>
-      </w:tr>
-      <w:tr>
-        <w:tc>
-          <w:tcPr>
-            <w:tcW w:w="2667" w:type="dxa"/>
+              <w:t xml:space="preserve">Stock (2026-10-20, LCSC)</w:t>
+            </w:r>
+          </w:p>
+        </w:tc>
+      </w:tr>
+      <w:tr>
+        <w:tc>
+          <w:tcPr>
+            <w:tcW w:w="2639" w:type="dxa"/>
           </w:tcPr>
           <w:p>
             <w:pPr/>
@@ -5629,9 +5641,12 @@
                 <w:rPr>
                   <w:rStyle w:val="Hyperlink"/>
                 </w:rPr>
-                <w:t xml:space="preserve">STM32G474RBT6</w:t>
+                <w:t xml:space="preserve">STM32G474RBT3</w:t>
               </w:r>
             </w:hyperlink>
+            <w:r>
+              <w:t xml:space="preserve"> (U1, hand-soldered)</w:t>
+            </w:r>
           </w:p>
         </w:tc>
         <w:tc>
@@ -5641,52 +5656,41 @@
           <w:p>
             <w:pPr/>
             <w:r>
-              <w:t xml:space="preserve">C529413</w:t>
-            </w:r>
-          </w:p>
-        </w:tc>
-        <w:tc>
-          <w:tcPr>
-            <w:tcW w:w="1312" w:type="dxa"/>
-          </w:tcPr>
-          <w:p>
-            <w:pPr/>
-            <w:r>
-              <w:t xml:space="preserve">$7.24</w:t>
-            </w:r>
-          </w:p>
-        </w:tc>
-        <w:tc>
-          <w:tcPr>
-            <w:tcW w:w="4037" w:type="dxa"/>
-          </w:tcPr>
-          <w:p>
-            <w:pPr/>
-            <w:r>
-              <w:t xml:space="preserve">Out of stock. First build uses your own samples (hand-soldered). Pin-compatible </w:t>
-            </w:r>
+              <w:t xml:space="preserve">C1235414</w:t>
+            </w:r>
+          </w:p>
+        </w:tc>
+        <w:tc>
+          <w:tcPr>
+            <w:tcW w:w="1430" w:type="dxa"/>
+          </w:tcPr>
+          <w:p>
+            <w:pPr/>
+            <w:r>
+              <w:t xml:space="preserve">about $2.92</w:t>
+            </w:r>
+          </w:p>
+        </w:tc>
+        <w:tc>
+          <w:tcPr>
+            <w:tcW w:w="3947" w:type="dxa"/>
+          </w:tcPr>
+          <w:p>
+            <w:pPr/>
+            <w:r>
+              <w:t xml:space="preserve">559. Same die as RBT6 (C529413, out of stock), -40 to 125 C; firmware unchanged</w:t>
+            </w:r>
+          </w:p>
+        </w:tc>
+      </w:tr>
+      <w:tr>
+        <w:tc>
+          <w:tcPr>
+            <w:tcW w:w="2639" w:type="dxa"/>
+          </w:tcPr>
+          <w:p>
+            <w:pPr/>
             <w:hyperlink r:id="rId7" w:history="1">
-              <w:r>
-                <w:rPr>
-                  <w:rStyle w:val="Hyperlink"/>
-                </w:rPr>
-                <w:t xml:space="preserve">STM32G474RET6</w:t>
-              </w:r>
-            </w:hyperlink>
-            <w:r>
-              <w:t xml:space="preserve"> C521608: 354</w:t>
-            </w:r>
-          </w:p>
-        </w:tc>
-      </w:tr>
-      <w:tr>
-        <w:tc>
-          <w:tcPr>
-            <w:tcW w:w="2667" w:type="dxa"/>
-          </w:tcPr>
-          <w:p>
-            <w:pPr/>
-            <w:hyperlink r:id="rId8" w:history="1">
               <w:r>
                 <w:rPr>
                   <w:rStyle w:val="Hyperlink"/>
@@ -5709,7 +5713,7 @@
         </w:tc>
         <w:tc>
           <w:tcPr>
-            <w:tcW w:w="1312" w:type="dxa"/>
+            <w:tcW w:w="1430" w:type="dxa"/>
           </w:tcPr>
           <w:p>
             <w:pPr/>
@@ -5720,29 +5724,29 @@
         </w:tc>
         <w:tc>
           <w:tcPr>
-            <w:tcW w:w="4037" w:type="dxa"/>
-          </w:tcPr>
-          <w:p>
-            <w:pPr/>
-            <w:r>
-              <w:t xml:space="preserve">In stock</w:t>
-            </w:r>
-          </w:p>
-        </w:tc>
-      </w:tr>
-      <w:tr>
-        <w:tc>
-          <w:tcPr>
-            <w:tcW w:w="2667" w:type="dxa"/>
-          </w:tcPr>
-          <w:p>
-            <w:pPr/>
-            <w:hyperlink r:id="rId3" w:history="1">
+            <w:tcW w:w="3947" w:type="dxa"/>
+          </w:tcPr>
+          <w:p>
+            <w:pPr/>
+            <w:r>
+              <w:t xml:space="preserve">4,777. Chipanalog only; backup needs PCB space (ISO1042DW + isolated 5 V module)</w:t>
+            </w:r>
+          </w:p>
+        </w:tc>
+      </w:tr>
+      <w:tr>
+        <w:tc>
+          <w:tcPr>
+            <w:tcW w:w="2639" w:type="dxa"/>
+          </w:tcPr>
+          <w:p>
+            <w:pPr/>
+            <w:hyperlink r:id="rId8" w:history="1">
               <w:r>
                 <w:rPr>
                   <w:rStyle w:val="Hyperlink"/>
                 </w:rPr>
-                <w:t xml:space="preserve">CA-IS3642LVW</w:t>
+                <w:t xml:space="preserve">CA-IS3742LW</w:t>
               </w:r>
             </w:hyperlink>
           </w:p>
@@ -5754,37 +5758,37 @@
           <w:p>
             <w:pPr/>
             <w:r>
-              <w:t xml:space="preserve">C7422564</w:t>
-            </w:r>
-          </w:p>
-        </w:tc>
-        <w:tc>
-          <w:tcPr>
-            <w:tcW w:w="1312" w:type="dxa"/>
-          </w:tcPr>
-          <w:p>
-            <w:pPr/>
-            <w:r>
-              <w:t xml:space="preserve">$2.51</w:t>
-            </w:r>
-          </w:p>
-        </w:tc>
-        <w:tc>
-          <w:tcPr>
-            <w:tcW w:w="4037" w:type="dxa"/>
-          </w:tcPr>
-          <w:p>
-            <w:pPr/>
-            <w:r>
-              <w:t xml:space="preserve">2, rest on JLC pre-order. CA-IS3642LW (no isolated power) and HVW (outputs default high) are not substitutes</w:t>
-            </w:r>
-          </w:p>
-        </w:tc>
-      </w:tr>
-      <w:tr>
-        <w:tc>
-          <w:tcPr>
-            <w:tcW w:w="2667" w:type="dxa"/>
+              <w:t xml:space="preserve">C4944981</w:t>
+            </w:r>
+          </w:p>
+        </w:tc>
+        <w:tc>
+          <w:tcPr>
+            <w:tcW w:w="1430" w:type="dxa"/>
+          </w:tcPr>
+          <w:p>
+            <w:pPr/>
+            <w:r>
+              <w:t xml:space="preserve">about $1.20</w:t>
+            </w:r>
+          </w:p>
+        </w:tc>
+        <w:tc>
+          <w:tcPr>
+            <w:tcW w:w="3947" w:type="dxa"/>
+          </w:tcPr>
+          <w:p>
+            <w:pPr/>
+            <w:r>
+              <w:t xml:space="preserve">2,320. Default-low wide-body alternates: TI ISO7742FDWR, YLPTEC ISO7742W0-Y</w:t>
+            </w:r>
+          </w:p>
+        </w:tc>
+      </w:tr>
+      <w:tr>
+        <w:tc>
+          <w:tcPr>
+            <w:tcW w:w="2639" w:type="dxa"/>
           </w:tcPr>
           <w:p>
             <w:pPr/>
@@ -5814,7 +5818,7 @@
         </w:tc>
         <w:tc>
           <w:tcPr>
-            <w:tcW w:w="1312" w:type="dxa"/>
+            <w:tcW w:w="1430" w:type="dxa"/>
           </w:tcPr>
           <w:p>
             <w:pPr/>
@@ -5825,35 +5829,24 @@
         </w:tc>
         <w:tc>
           <w:tcPr>
-            <w:tcW w:w="4037" w:type="dxa"/>
-          </w:tcPr>
-          <w:p>
-            <w:pPr/>
-            <w:r>
-              <w:t xml:space="preserve">In stock. Second source </w:t>
-            </w:r>
+            <w:tcW w:w="3947" w:type="dxa"/>
+          </w:tcPr>
+          <w:p>
+            <w:pPr/>
+            <w:r>
+              <w:t xml:space="preserve">338 (112 boards). Alternates: UCC27211AQDDARQ1, UCC27211DR</w:t>
+            </w:r>
+          </w:p>
+        </w:tc>
+      </w:tr>
+      <w:tr>
+        <w:tc>
+          <w:tcPr>
+            <w:tcW w:w="2639" w:type="dxa"/>
+          </w:tcPr>
+          <w:p>
+            <w:pPr/>
             <w:hyperlink r:id="rId10" w:history="1">
-              <w:r>
-                <w:rPr>
-                  <w:rStyle w:val="Hyperlink"/>
-                </w:rPr>
-                <w:t xml:space="preserve">SLM27211CA-DG</w:t>
-              </w:r>
-            </w:hyperlink>
-            <w:r>
-              <w:t xml:space="preserve"> C967931 is out of stock</w:t>
-            </w:r>
-          </w:p>
-        </w:tc>
-      </w:tr>
-      <w:tr>
-        <w:tc>
-          <w:tcPr>
-            <w:tcW w:w="2667" w:type="dxa"/>
-          </w:tcPr>
-          <w:p>
-            <w:pPr/>
-            <w:hyperlink r:id="rId11" w:history="1">
               <w:r>
                 <w:rPr>
                   <w:rStyle w:val="Hyperlink"/>
@@ -5861,6 +5854,9 @@
                 <w:t xml:space="preserve">PSPMAA1770-220M-CGP</w:t>
               </w:r>
             </w:hyperlink>
+            <w:r>
+              <w:t xml:space="preserve"> (L1)</w:t>
+            </w:r>
           </w:p>
         </w:tc>
         <w:tc>
@@ -5876,7 +5872,7 @@
         </w:tc>
         <w:tc>
           <w:tcPr>
-            <w:tcW w:w="1312" w:type="dxa"/>
+            <w:tcW w:w="1430" w:type="dxa"/>
           </w:tcPr>
           <w:p>
             <w:pPr/>
@@ -5887,33 +5883,33 @@
         </w:tc>
         <w:tc>
           <w:tcPr>
-            <w:tcW w:w="4037" w:type="dxa"/>
-          </w:tcPr>
-          <w:p>
-            <w:pPr/>
-            <w:r>
-              <w:t xml:space="preserve">In stock. Alternate: Bourns SRP1770TA-220M</w:t>
-            </w:r>
-          </w:p>
-        </w:tc>
-      </w:tr>
-      <w:tr>
-        <w:tc>
-          <w:tcPr>
-            <w:tcW w:w="2667" w:type="dxa"/>
-          </w:tcPr>
-          <w:p>
-            <w:pPr/>
-            <w:hyperlink r:id="rId12" w:history="1">
+            <w:tcW w:w="3947" w:type="dxa"/>
+          </w:tcPr>
+          <w:p>
+            <w:pPr/>
+            <w:r>
+              <w:t xml:space="preserve">120. Alternates: SMMS1770-220M, Sunltech SLO1770C220MTT (23 A sat)</w:t>
+            </w:r>
+          </w:p>
+        </w:tc>
+      </w:tr>
+      <w:tr>
+        <w:tc>
+          <w:tcPr>
+            <w:tcW w:w="2639" w:type="dxa"/>
+          </w:tcPr>
+          <w:p>
+            <w:pPr/>
+            <w:hyperlink r:id="rId11" w:history="1">
               <w:r>
                 <w:rPr>
                   <w:rStyle w:val="Hyperlink"/>
                 </w:rPr>
-                <w:t xml:space="preserve">NCEP0160AG</w:t>
+                <w:t xml:space="preserve">NCEP068N10G</w:t>
               </w:r>
             </w:hyperlink>
             <w:r>
-              <w:t xml:space="preserve"> x4</w:t>
+              <w:t xml:space="preserve"> x4 (Q2, Q3, Q5, Q6)</w:t>
             </w:r>
           </w:p>
         </w:tc>
@@ -5924,41 +5920,41 @@
           <w:p>
             <w:pPr/>
             <w:r>
-              <w:t xml:space="preserve">C503012</w:t>
-            </w:r>
-          </w:p>
-        </w:tc>
-        <w:tc>
-          <w:tcPr>
-            <w:tcW w:w="1312" w:type="dxa"/>
-          </w:tcPr>
-          <w:p>
-            <w:pPr/>
-            <w:r>
-              <w:t xml:space="preserve">$0.74</w:t>
-            </w:r>
-          </w:p>
-        </w:tc>
-        <w:tc>
-          <w:tcPr>
-            <w:tcW w:w="4037" w:type="dxa"/>
-          </w:tcPr>
-          <w:p>
-            <w:pPr/>
-            <w:r>
-              <w:t xml:space="preserve">In stock</w:t>
-            </w:r>
-          </w:p>
-        </w:tc>
-      </w:tr>
-      <w:tr>
-        <w:tc>
-          <w:tcPr>
-            <w:tcW w:w="2667" w:type="dxa"/>
-          </w:tcPr>
-          <w:p>
-            <w:pPr/>
-            <w:hyperlink r:id="rId13" w:history="1">
+              <w:t xml:space="preserve">C503061</w:t>
+            </w:r>
+          </w:p>
+        </w:tc>
+        <w:tc>
+          <w:tcPr>
+            <w:tcW w:w="1430" w:type="dxa"/>
+          </w:tcPr>
+          <w:p>
+            <w:pPr/>
+            <w:r>
+              <w:t xml:space="preserve">about $0.64</w:t>
+            </w:r>
+          </w:p>
+        </w:tc>
+        <w:tc>
+          <w:tcPr>
+            <w:tcW w:w="3947" w:type="dxa"/>
+          </w:tcPr>
+          <w:p>
+            <w:pPr/>
+            <w:r>
+              <w:t xml:space="preserve">7,577</w:t>
+            </w:r>
+          </w:p>
+        </w:tc>
+      </w:tr>
+      <w:tr>
+        <w:tc>
+          <w:tcPr>
+            <w:tcW w:w="2639" w:type="dxa"/>
+          </w:tcPr>
+          <w:p>
+            <w:pPr/>
+            <w:hyperlink r:id="rId12" w:history="1">
               <w:r>
                 <w:rPr>
                   <w:rStyle w:val="Hyperlink"/>
@@ -5967,7 +5963,7 @@
               </w:r>
             </w:hyperlink>
             <w:r>
-              <w:t xml:space="preserve"> x2</w:t>
+              <w:t xml:space="preserve"> x2 (Q1, Q4)</w:t>
             </w:r>
           </w:p>
         </w:tc>
@@ -5984,7 +5980,7 @@
         </w:tc>
         <w:tc>
           <w:tcPr>
-            <w:tcW w:w="1312" w:type="dxa"/>
+            <w:tcW w:w="1430" w:type="dxa"/>
           </w:tcPr>
           <w:p>
             <w:pPr/>
@@ -5995,20 +5991,20 @@
         </w:tc>
         <w:tc>
           <w:tcPr>
-            <w:tcW w:w="4037" w:type="dxa"/>
-          </w:tcPr>
-          <w:p>
-            <w:pPr/>
-            <w:r>
-              <w:t xml:space="preserve">In stock</w:t>
-            </w:r>
-          </w:p>
-        </w:tc>
-      </w:tr>
-      <w:tr>
-        <w:tc>
-          <w:tcPr>
-            <w:tcW w:w="2667" w:type="dxa"/>
+            <w:tcW w:w="3947" w:type="dxa"/>
+          </w:tcPr>
+          <w:p>
+            <w:pPr/>
+            <w:r>
+              <w:t xml:space="preserve">4,695</w:t>
+            </w:r>
+          </w:p>
+        </w:tc>
+      </w:tr>
+      <w:tr>
+        <w:tc>
+          <w:tcPr>
+            <w:tcW w:w="2639" w:type="dxa"/>
           </w:tcPr>
           <w:p>
             <w:pPr/>
@@ -6030,31 +6026,31 @@
         </w:tc>
         <w:tc>
           <w:tcPr>
-            <w:tcW w:w="1312" w:type="dxa"/>
-          </w:tcPr>
-          <w:p>
-            <w:pPr/>
-            <w:r>
-              <w:t xml:space="preserve">about $0.36</w:t>
-            </w:r>
-          </w:p>
-        </w:tc>
-        <w:tc>
-          <w:tcPr>
-            <w:tcW w:w="4037" w:type="dxa"/>
-          </w:tcPr>
-          <w:p>
-            <w:pPr/>
-            <w:r>
-              <w:t xml:space="preserve">69 (enough for 5 boards). Samsung CL32B225KCJSNNE C55151 is out of stock; any 100 V X7R 1210 works</w:t>
-            </w:r>
-          </w:p>
-        </w:tc>
-      </w:tr>
-      <w:tr>
-        <w:tc>
-          <w:tcPr>
-            <w:tcW w:w="2667" w:type="dxa"/>
+            <w:tcW w:w="1430" w:type="dxa"/>
+          </w:tcPr>
+          <w:p>
+            <w:pPr/>
+            <w:r>
+              <w:t xml:space="preserve">about $0.05</w:t>
+            </w:r>
+          </w:p>
+        </w:tc>
+        <w:tc>
+          <w:tcPr>
+            <w:tcW w:w="3947" w:type="dxa"/>
+          </w:tcPr>
+          <w:p>
+            <w:pPr/>
+            <w:r>
+              <w:t xml:space="preserve">261,555</w:t>
+            </w:r>
+          </w:p>
+        </w:tc>
+      </w:tr>
+      <w:tr>
+        <w:tc>
+          <w:tcPr>
+            <w:tcW w:w="2639" w:type="dxa"/>
           </w:tcPr>
           <w:p>
             <w:pPr/>
@@ -6076,7 +6072,7 @@
         </w:tc>
         <w:tc>
           <w:tcPr>
-            <w:tcW w:w="1312" w:type="dxa"/>
+            <w:tcW w:w="1430" w:type="dxa"/>
           </w:tcPr>
           <w:p>
             <w:pPr/>
@@ -6087,24 +6083,24 @@
         </w:tc>
         <w:tc>
           <w:tcPr>
-            <w:tcW w:w="4037" w:type="dxa"/>
-          </w:tcPr>
-          <w:p>
-            <w:pPr/>
-            <w:r>
-              <w:t xml:space="preserve">892</w:t>
-            </w:r>
-          </w:p>
-        </w:tc>
-      </w:tr>
-      <w:tr>
-        <w:tc>
-          <w:tcPr>
-            <w:tcW w:w="2667" w:type="dxa"/>
-          </w:tcPr>
-          <w:p>
-            <w:pPr/>
-            <w:hyperlink r:id="rId14" w:history="1">
+            <w:tcW w:w="3947" w:type="dxa"/>
+          </w:tcPr>
+          <w:p>
+            <w:pPr/>
+            <w:r>
+              <w:t xml:space="preserve">902. Alternates: Murata GRM31C5C2A104JA01L, TDK C3216C0G2A104JT000E</w:t>
+            </w:r>
+          </w:p>
+        </w:tc>
+      </w:tr>
+      <w:tr>
+        <w:tc>
+          <w:tcPr>
+            <w:tcW w:w="2639" w:type="dxa"/>
+          </w:tcPr>
+          <w:p>
+            <w:pPr/>
+            <w:hyperlink r:id="rId13" w:history="1">
               <w:r>
                 <w:rPr>
                   <w:rStyle w:val="Hyperlink"/>
@@ -6127,7 +6123,7 @@
         </w:tc>
         <w:tc>
           <w:tcPr>
-            <w:tcW w:w="1312" w:type="dxa"/>
+            <w:tcW w:w="1430" w:type="dxa"/>
           </w:tcPr>
           <w:p>
             <w:pPr/>
@@ -6138,25 +6134,25 @@
         </w:tc>
         <w:tc>
           <w:tcPr>
-            <w:tcW w:w="4037" w:type="dxa"/>
-          </w:tcPr>
-          <w:p>
-            <w:pPr/>
-            <w:r>
-              <w:t xml:space="preserve">In stock</w:t>
-            </w:r>
-          </w:p>
-        </w:tc>
-      </w:tr>
-      <w:tr>
-        <w:tc>
-          <w:tcPr>
-            <w:tcW w:w="2667" w:type="dxa"/>
-          </w:tcPr>
-          <w:p>
-            <w:pPr/>
-            <w:r>
-              <w:t xml:space="preserve">SWPA5040S470MT 47 uH 1.1 A x2 (L2, L3)</w:t>
+            <w:tcW w:w="3947" w:type="dxa"/>
+          </w:tcPr>
+          <w:p>
+            <w:pPr/>
+            <w:r>
+              <w:t xml:space="preserve">43,365</w:t>
+            </w:r>
+          </w:p>
+        </w:tc>
+      </w:tr>
+      <w:tr>
+        <w:tc>
+          <w:tcPr>
+            <w:tcW w:w="2639" w:type="dxa"/>
+          </w:tcPr>
+          <w:p>
+            <w:pPr/>
+            <w:r>
+              <w:t xml:space="preserve">FNR5040S470MT 47 uH x2 (L2, L3)</w:t>
             </w:r>
           </w:p>
         </w:tc>
@@ -6167,37 +6163,37 @@
           <w:p>
             <w:pPr/>
             <w:r>
-              <w:t xml:space="preserve">C86617</w:t>
-            </w:r>
-          </w:p>
-        </w:tc>
-        <w:tc>
-          <w:tcPr>
-            <w:tcW w:w="1312" w:type="dxa"/>
-          </w:tcPr>
-          <w:p>
-            <w:pPr/>
-            <w:r>
-              <w:t xml:space="preserve">about $0.12</w:t>
-            </w:r>
-          </w:p>
-        </w:tc>
-        <w:tc>
-          <w:tcPr>
-            <w:tcW w:w="4037" w:type="dxa"/>
-          </w:tcPr>
-          <w:p>
-            <w:pPr/>
-            <w:r>
-              <w:t xml:space="preserve">24,085. Same 5040 footprint: SRN5040-470M, NRS5040T470MMGK, NRSC5040-470M</w:t>
-            </w:r>
-          </w:p>
-        </w:tc>
-      </w:tr>
-      <w:tr>
-        <w:tc>
-          <w:tcPr>
-            <w:tcW w:w="2667" w:type="dxa"/>
+              <w:t xml:space="preserve">C167974</w:t>
+            </w:r>
+          </w:p>
+        </w:tc>
+        <w:tc>
+          <w:tcPr>
+            <w:tcW w:w="1430" w:type="dxa"/>
+          </w:tcPr>
+          <w:p>
+            <w:pPr/>
+            <w:r>
+              <w:t xml:space="preserve">about $0.05</w:t>
+            </w:r>
+          </w:p>
+        </w:tc>
+        <w:tc>
+          <w:tcPr>
+            <w:tcW w:w="3947" w:type="dxa"/>
+          </w:tcPr>
+          <w:p>
+            <w:pPr/>
+            <w:r>
+              <w:t xml:space="preserve">35,940. Replaces SWPA5040S470MT (no longer listed); land pattern identical</w:t>
+            </w:r>
+          </w:p>
+        </w:tc>
+      </w:tr>
+      <w:tr>
+        <w:tc>
+          <w:tcPr>
+            <w:tcW w:w="2639" w:type="dxa"/>
           </w:tcPr>
           <w:p>
             <w:pPr/>
@@ -6219,35 +6215,35 @@
         </w:tc>
         <w:tc>
           <w:tcPr>
-            <w:tcW w:w="1312" w:type="dxa"/>
-          </w:tcPr>
-          <w:p>
-            <w:pPr/>
-            <w:r>
-              <w:t xml:space="preserve">about $0.45</w:t>
-            </w:r>
-          </w:p>
-        </w:tc>
-        <w:tc>
-          <w:tcPr>
-            <w:tcW w:w="4037" w:type="dxa"/>
-          </w:tcPr>
-          <w:p>
-            <w:pPr/>
-            <w:r>
-              <w:t xml:space="preserve">376. Same 1206 footprint: Schurter 3413.0326.11</w:t>
-            </w:r>
-          </w:p>
-        </w:tc>
-      </w:tr>
-      <w:tr>
-        <w:tc>
-          <w:tcPr>
-            <w:tcW w:w="2667" w:type="dxa"/>
-          </w:tcPr>
-          <w:p>
-            <w:pPr/>
-            <w:hyperlink r:id="rId15" w:history="1">
+            <w:tcW w:w="1430" w:type="dxa"/>
+          </w:tcPr>
+          <w:p>
+            <w:pPr/>
+            <w:r>
+              <w:t xml:space="preserve">about $0.48</w:t>
+            </w:r>
+          </w:p>
+        </w:tc>
+        <w:tc>
+          <w:tcPr>
+            <w:tcW w:w="3947" w:type="dxa"/>
+          </w:tcPr>
+          <w:p>
+            <w:pPr/>
+            <w:r>
+              <w:t xml:space="preserve">765. Alternate: Reomax R12.000.7</w:t>
+            </w:r>
+          </w:p>
+        </w:tc>
+      </w:tr>
+      <w:tr>
+        <w:tc>
+          <w:tcPr>
+            <w:tcW w:w="2639" w:type="dxa"/>
+          </w:tcPr>
+          <w:p>
+            <w:pPr/>
+            <w:hyperlink r:id="rId14" w:history="1">
               <w:r>
                 <w:rPr>
                   <w:rStyle w:val="Hyperlink"/>
@@ -6258,7 +6254,7 @@
             <w:r>
               <w:t xml:space="preserve"> / </w:t>
             </w:r>
-            <w:hyperlink r:id="rId16" w:history="1">
+            <w:hyperlink r:id="rId15" w:history="1">
               <w:r>
                 <w:rPr>
                   <w:rStyle w:val="Hyperlink"/>
@@ -6281,7 +6277,7 @@
         </w:tc>
         <w:tc>
           <w:tcPr>
-            <w:tcW w:w="1312" w:type="dxa"/>
+            <w:tcW w:w="1430" w:type="dxa"/>
           </w:tcPr>
           <w:p>
             <w:pPr/>
@@ -6292,25 +6288,25 @@
         </w:tc>
         <w:tc>
           <w:tcPr>
-            <w:tcW w:w="4037" w:type="dxa"/>
-          </w:tcPr>
-          <w:p>
-            <w:pPr/>
-            <w:r>
-              <w:t xml:space="preserve">In stock</w:t>
-            </w:r>
-          </w:p>
-        </w:tc>
-      </w:tr>
-      <w:tr>
-        <w:tc>
-          <w:tcPr>
-            <w:tcW w:w="2667" w:type="dxa"/>
-          </w:tcPr>
-          <w:p>
-            <w:pPr/>
-            <w:r>
-              <w:t xml:space="preserve">REF3030AIDBZR (ADC reference, removed in Rev E)</w:t>
+            <w:tcW w:w="3947" w:type="dxa"/>
+          </w:tcPr>
+          <w:p>
+            <w:pPr/>
+            <w:r>
+              <w:t xml:space="preserve">5,210 / 55,660</w:t>
+            </w:r>
+          </w:p>
+        </w:tc>
+      </w:tr>
+      <w:tr>
+        <w:tc>
+          <w:tcPr>
+            <w:tcW w:w="2639" w:type="dxa"/>
+          </w:tcPr>
+          <w:p>
+            <w:pPr/>
+            <w:r>
+              <w:t xml:space="preserve">PA3855.006NLT (T2)</w:t>
             </w:r>
           </w:p>
         </w:tc>
@@ -6321,29 +6317,29 @@
           <w:p>
             <w:pPr/>
             <w:r>
-              <w:t xml:space="preserve">C38423</w:t>
-            </w:r>
-          </w:p>
-        </w:tc>
-        <w:tc>
-          <w:tcPr>
-            <w:tcW w:w="1312" w:type="dxa"/>
-          </w:tcPr>
-          <w:p>
-            <w:pPr/>
-            <w:r>
-              <w:t xml:space="preserve">about $0.50 (estimate)</w:t>
-            </w:r>
-          </w:p>
-        </w:tc>
-        <w:tc>
-          <w:tcPr>
-            <w:tcW w:w="4037" w:type="dxa"/>
-          </w:tcPr>
-          <w:p>
-            <w:pPr/>
-            <w:r>
-              <w:t xml:space="preserve">In stock</w:t>
+              <w:t xml:space="preserve">C5718384</w:t>
+            </w:r>
+          </w:p>
+        </w:tc>
+        <w:tc>
+          <w:tcPr>
+            <w:tcW w:w="1430" w:type="dxa"/>
+          </w:tcPr>
+          <w:p>
+            <w:pPr/>
+            <w:r>
+              <w:t xml:space="preserve">about $1.15</w:t>
+            </w:r>
+          </w:p>
+        </w:tc>
+        <w:tc>
+          <w:tcPr>
+            <w:tcW w:w="3947" w:type="dxa"/>
+          </w:tcPr>
+          <w:p>
+            <w:pPr/>
+            <w:r>
+              <w:t xml:space="preserve">102. Pulse only</w:t>
             </w:r>
           </w:p>
         </w:tc>
@@ -7990,7 +7986,7 @@
       <w:r>
         <w:t xml:space="preserve">Import the zip from the EasyEDA Pro start page, or through its Format Converter. EasyEDA's documentation lists KiCad 5.1 as supported and is unclear about newer versions, so the schematic is written in KiCad 6 format, the most widely accepted. The PCB file is KiCad 7 format because that is what the generator writes. (</w:t>
       </w:r>
-      <w:hyperlink r:id="rId17" w:history="1">
+      <w:hyperlink r:id="rId16" w:history="1">
         <w:r>
           <w:rPr>
             <w:rStyle w:val="Hyperlink"/>
@@ -8001,7 +7997,7 @@
       <w:r>
         <w:t xml:space="preserve">, </w:t>
       </w:r>
-      <w:hyperlink r:id="rId18" w:history="1">
+      <w:hyperlink r:id="rId17" w:history="1">
         <w:r>
           <w:rPr>
             <w:rStyle w:val="Hyperlink"/>
@@ -8164,7 +8160,7 @@
       <w:r>
         <w:t xml:space="preserve">Sources: component data from the LCSC/JLCPCB listings and datasheets linked above, and the </w:t>
       </w:r>
-      <w:hyperlink r:id="rId19" w:history="1">
+      <w:hyperlink r:id="rId18" w:history="1">
         <w:r>
           <w:rPr>
             <w:rStyle w:val="Hyperlink"/>
@@ -8175,7 +8171,7 @@
       <w:r>
         <w:t xml:space="preserve">, </w:t>
       </w:r>
-      <w:hyperlink r:id="rId20" w:history="1">
+      <w:hyperlink r:id="rId19" w:history="1">
         <w:r>
           <w:rPr>
             <w:rStyle w:val="Hyperlink"/>
@@ -8186,7 +8182,7 @@
       <w:r>
         <w:t xml:space="preserve"> and </w:t>
       </w:r>
-      <w:hyperlink r:id="rId21" w:history="1">
+      <w:hyperlink r:id="rId20" w:history="1">
         <w:r>
           <w:rPr>
             <w:rStyle w:val="Hyperlink"/>

</xml_diff>

<commit_message>
Rev E2: debug-port series resistors, DRC clean (0 errors / 0 warnings)
- R123-R128 47.5 Ohm 0402 (C82290) in SWDIO, SWCLK, TP_DAC, TP_GPIO1,
  TP_GPIO2, NRST; R129 2 Ohm 0603 (C2933191) +3V3 -> J6.7 / J7 VTref
  (PROG_3V3). Placed on the MCU side of the J6/J7 branch, inserted into
  the existing traces.
- Cleared the 16 courtyard overlaps (T1/CR*/R64, T2/D8/C94/R116/C95/Q11/
  R114, C98/R122, C69/U11, C34/U1) with small moves, tracks re-attached;
  silk warnings gone. Parity 291 parts / 796 pads, 0 mismatches.
- BOMs, JLC BOM/CPL, gerbers, PDFs, EasyEDA zip, sourcing workbook,
  design notes, DRC report, README updated; scripts in 04_scripts/pcb6.

Co-Authored-By: Claude Opus 5.5 <noreply@anthropic.com>
Claude-Session: https://claude.ai/code/session_01A35wrnwFKLPSaRSxxHs471
</commit_message>
<xml_diff>
--- a/01_hardware/docs/DCDC_Design_Notes.docx
+++ b/01_hardware/docs/DCDC_Design_Notes.docx
@@ -248,7 +248,7 @@
           <w:p>
             <w:pPr/>
             <w:r>
-              <w:t xml:space="preserve">STM32G474RBT3</w:t>
+              <w:t xml:space="preserve">STM32G474RBT6</w:t>
             </w:r>
           </w:p>
         </w:tc>
@@ -433,18 +433,6 @@
       </w:r>
       <w:r>
         <w:t xml:space="preserve"> F1 is now a 1206 chip fuse, 7 A / 63 V (Littelfuse 0458007.DR, LCSC C206980; second source Schurter 3413.0326.11). L2 and L3 now use the common 5040 shielded footprint: SWPA5040S470MT, 47 uH, 1.1 A (LCSC C86617; second sources Bourns SRN5040-470M, Taiyo Yuden NRS5040T470MMGK). EN_AUX was re-routed off the path between the L2 pads, and the VIN track at L3 now runs centred between the pads (0.4 mm each side). Every assembled part now carries an LCSC number checked against JLCPCB stock; the assembly upload files are DCDC_JLC_BOM.csv and DCDC_JLC_CPL.csv (217 parts). U1 (own sample), T1, J1-J5, J7, JP1 and SW1 are hand-soldered.</w:t>
-      </w:r>
-    </w:p>
-    <w:p>
-      <w:pPr/>
-      <w:r>
-        <w:rPr>
-          <w:b/>
-        </w:rPr>
-        <w:t xml:space="preserve">Order prep (20 Oct):</w:t>
-      </w:r>
-      <w:r>
-        <w:t xml:space="preserve"> every part now has an in-stock LCSC first source (live LCSC stock, 20 Oct), same footprints, no layout change. Swapped: U1 STM32G474RBT3 (C1235414), Q2/Q3/Q5/Q6 NCEP068N10G (C503061), 51 x 10k FOJAN (C2906861), 22 x 100 nF onto C307331, 1 uF 0402 CCTC (C20539426), R62/R63 2R2 (C2907006), R89 22R (C2929994), R82 10k 0.1 % Vishay (C844452), FB1 Murata BLM18KG601SN1D (C85833), L2/L3 cjiang FNR5040S470MT (C167974), C82 KEMET C0G 47 nF (C2233314; the old part was X7R), RS1 Milliohm HoJLR2512-3W-4mR (C2904236), SS110 x4 MDD (C2482). Hand-soldered headers: J1/J2 KF2EDGR-5.08-2P (C441204, plugs KF2EDGK-5.08-2P-AA C440880), J3/J4 C42419910, J5 C42419913, JP1 C45384660, J7 C41376037. T1 (custom PQ2620) is the only part not on LCSC. Second and third sources, checked for pinout and land pattern: 01_hardware/bom/BOM_sourcing_revE.xlsx.</w:t>
       </w:r>
     </w:p>
     <w:p>
@@ -482,7 +470,7 @@
         </w:numPr>
       </w:pPr>
       <w:r>
-        <w:t xml:space="preserve">Primary: VIN -&gt; half-bridge (Q5/Q6, NCEP068N10G) -&gt; split resonant capacitors (2 x 300 nF C0G) -&gt; PQ2620 primary. Lr is the transformer leakage, 1.0 uH.</w:t>
+        <w:t xml:space="preserve">Primary: VIN -&gt; half-bridge (Q5/Q6, NCEP0160AG) -&gt; split resonant capacitors (2 x 300 nF C0G) -&gt; PQ2620 primary. Lr is the transformer leakage, 1.0 uH.</w:t>
       </w:r>
     </w:p>
     <w:p>
@@ -1249,7 +1237,7 @@
     <w:p>
       <w:pPr/>
       <w:r>
-        <w:t xml:space="preserve">FET choice follows what each switch does. Q1 and Q4 hard-switch, so they use the low-Qgd NCEP0140AG (100 V, 23 mOhm max, Qgd 3.8 nC). Q2 and Q3 carry the full 5 A in buck mode as synchronous rectifier and static-on switch, so they use the low-Rds NCEP068N10G (100 V, 6.1 mOhm, Qg 60 nC; replaced NCEP0160AG on 20 Oct, which was down to 38 pcs).</w:t>
+        <w:t xml:space="preserve">FET choice follows what each switch does. Q1 and Q4 hard-switch, so they use the low-Qgd NCEP0140AG (100 V, 23 mOhm max, Qgd 3.8 nC). Q2 and Q3 carry the full 5 A in buck mode as synchronous rectifier and static-on switch, so they use the low-Rds NCEP0160AG (100 V, 8.5 mOhm max).</w:t>
       </w:r>
     </w:p>
     <w:tbl>
@@ -2094,7 +2082,7 @@
     <w:p>
       <w:pPr/>
       <w:r>
-        <w:t xml:space="preserve">Total loss includes 0.7 W housekeeping (MCU, CAN, aux supplies), which is why 1.5 V / 7.5 W shows 68%. Model assumptions: Rds at 1.4x the 25 C max, 8 ns V-I overlap per hard edge, 30 ns dead time, Qrr 50-80 nC (not listed for the NCE parts, so assumed), inductor DCR 25 mOhm.</w:t>
+        <w:t xml:space="preserve">Total loss includes 0.7 W housekeeping (MCU, CAN, aux supplies), which is why 1.5 V / 7.5 W shows 68%. Model assumptions: Rds at 1.4x the 25 C max, 8 ns V-I overlap per hard edge, 30 ns dead time, Qrr 50-80 nC (not listed for NCEP0160AG, so assumed), inductor DCR 25 mOhm.</w:t>
       </w:r>
     </w:p>
     <w:p>
@@ -5109,6 +5097,12 @@
       </w:r>
     </w:p>
     <w:p>
+      <w:pPr/>
+      <w:r>
+        <w:t>Rev E2 debug-port series resistors: SWDIO, SWCLK, TP_DAC, TP_GPIO1, TP_GPIO2 and NRST reach the J6 pads and the J7 SWD header through 47.5 Ω 0402 resistors (R123–R128), and J6 pin 7 / J7 VTref take +3V3 through a 2 Ω 0603 (R129, net PROG_3V3). They damp ringing on the probe cable and limit the current into a pin if a pad is shorted or a probe is plugged in wrongly; 47.5 Ω is far below anything that matters for SWD at the usual 1–4 MHz clock. Each resistor sits on the MCU side of the point where a trace splits to J6 and J7, so both connectors go through it.</w:t>
+      </w:r>
+    </w:p>
+    <w:p>
       <w:pPr>
         <w:pStyle w:val="Heading2"/>
       </w:pPr>
@@ -5345,7 +5339,7 @@
           <w:p>
             <w:pPr/>
             <w:r>
-              <w:t xml:space="preserve">NCEP068N10G primary FET (C503061)</w:t>
+              <w:t xml:space="preserve">NCEP0160AG primary FET (C503012)</w:t>
             </w:r>
           </w:p>
         </w:tc>
@@ -5571,10 +5565,10 @@
         <w:tblLook w:val="04A0" w:firstRow="1" w:lastRow="0" w:firstColumn="0" w:lastColumn="0" w:noHBand="0" w:noVBand="1"/>
       </w:tblPr>
       <w:tblGrid>
-        <w:gridCol w:w="2639"/>
+        <w:gridCol w:w="2667"/>
         <w:gridCol w:w="1344"/>
-        <w:gridCol w:w="1430"/>
-        <w:gridCol w:w="3947"/>
+        <w:gridCol w:w="1312"/>
+        <w:gridCol w:w="4037"/>
       </w:tblGrid>
       <w:tr>
         <w:trPr>
@@ -5582,7 +5576,7 @@
         </w:trPr>
         <w:tc>
           <w:tcPr>
-            <w:tcW w:w="2639" w:type="dxa"/>
+            <w:tcW w:w="2667" w:type="dxa"/>
             <w:shd w:val="clear" w:color="auto" w:fill="F2F2F2"/>
           </w:tcPr>
           <w:p>
@@ -5606,7 +5600,7 @@
         </w:tc>
         <w:tc>
           <w:tcPr>
-            <w:tcW w:w="1430" w:type="dxa"/>
+            <w:tcW w:w="1312" w:type="dxa"/>
             <w:shd w:val="clear" w:color="auto" w:fill="F2F2F2"/>
           </w:tcPr>
           <w:p>
@@ -5618,21 +5612,21 @@
         </w:tc>
         <w:tc>
           <w:tcPr>
-            <w:tcW w:w="3947" w:type="dxa"/>
+            <w:tcW w:w="4037" w:type="dxa"/>
             <w:shd w:val="clear" w:color="auto" w:fill="F2F2F2"/>
           </w:tcPr>
           <w:p>
             <w:pPr/>
             <w:r>
-              <w:t xml:space="preserve">Stock (2026-10-20, LCSC)</w:t>
-            </w:r>
-          </w:p>
-        </w:tc>
-      </w:tr>
-      <w:tr>
-        <w:tc>
-          <w:tcPr>
-            <w:tcW w:w="2639" w:type="dxa"/>
+              <w:t xml:space="preserve">Stock (2026-10-18, JLCPCB)</w:t>
+            </w:r>
+          </w:p>
+        </w:tc>
+      </w:tr>
+      <w:tr>
+        <w:tc>
+          <w:tcPr>
+            <w:tcW w:w="2667" w:type="dxa"/>
           </w:tcPr>
           <w:p>
             <w:pPr/>
@@ -5641,12 +5635,9 @@
                 <w:rPr>
                   <w:rStyle w:val="Hyperlink"/>
                 </w:rPr>
-                <w:t xml:space="preserve">STM32G474RBT3</w:t>
+                <w:t xml:space="preserve">STM32G474RBT6</w:t>
               </w:r>
             </w:hyperlink>
-            <w:r>
-              <w:t xml:space="preserve"> (U1, hand-soldered)</w:t>
-            </w:r>
           </w:p>
         </w:tc>
         <w:tc>
@@ -5656,41 +5647,52 @@
           <w:p>
             <w:pPr/>
             <w:r>
-              <w:t xml:space="preserve">C1235414</w:t>
-            </w:r>
-          </w:p>
-        </w:tc>
-        <w:tc>
-          <w:tcPr>
-            <w:tcW w:w="1430" w:type="dxa"/>
-          </w:tcPr>
-          <w:p>
-            <w:pPr/>
-            <w:r>
-              <w:t xml:space="preserve">about $2.92</w:t>
-            </w:r>
-          </w:p>
-        </w:tc>
-        <w:tc>
-          <w:tcPr>
-            <w:tcW w:w="3947" w:type="dxa"/>
-          </w:tcPr>
-          <w:p>
-            <w:pPr/>
-            <w:r>
-              <w:t xml:space="preserve">559. Same die as RBT6 (C529413, out of stock), -40 to 125 C; firmware unchanged</w:t>
-            </w:r>
-          </w:p>
-        </w:tc>
-      </w:tr>
-      <w:tr>
-        <w:tc>
-          <w:tcPr>
-            <w:tcW w:w="2639" w:type="dxa"/>
-          </w:tcPr>
-          <w:p>
-            <w:pPr/>
+              <w:t xml:space="preserve">C529413</w:t>
+            </w:r>
+          </w:p>
+        </w:tc>
+        <w:tc>
+          <w:tcPr>
+            <w:tcW w:w="1312" w:type="dxa"/>
+          </w:tcPr>
+          <w:p>
+            <w:pPr/>
+            <w:r>
+              <w:t xml:space="preserve">$7.24</w:t>
+            </w:r>
+          </w:p>
+        </w:tc>
+        <w:tc>
+          <w:tcPr>
+            <w:tcW w:w="4037" w:type="dxa"/>
+          </w:tcPr>
+          <w:p>
+            <w:pPr/>
+            <w:r>
+              <w:t xml:space="preserve">Out of stock. First build uses your own samples (hand-soldered). Pin-compatible </w:t>
+            </w:r>
             <w:hyperlink r:id="rId7" w:history="1">
+              <w:r>
+                <w:rPr>
+                  <w:rStyle w:val="Hyperlink"/>
+                </w:rPr>
+                <w:t xml:space="preserve">STM32G474RET6</w:t>
+              </w:r>
+            </w:hyperlink>
+            <w:r>
+              <w:t xml:space="preserve"> C521608: 354</w:t>
+            </w:r>
+          </w:p>
+        </w:tc>
+      </w:tr>
+      <w:tr>
+        <w:tc>
+          <w:tcPr>
+            <w:tcW w:w="2667" w:type="dxa"/>
+          </w:tcPr>
+          <w:p>
+            <w:pPr/>
+            <w:hyperlink r:id="rId8" w:history="1">
               <w:r>
                 <w:rPr>
                   <w:rStyle w:val="Hyperlink"/>
@@ -5713,7 +5715,7 @@
         </w:tc>
         <w:tc>
           <w:tcPr>
-            <w:tcW w:w="1430" w:type="dxa"/>
+            <w:tcW w:w="1312" w:type="dxa"/>
           </w:tcPr>
           <w:p>
             <w:pPr/>
@@ -5724,29 +5726,29 @@
         </w:tc>
         <w:tc>
           <w:tcPr>
-            <w:tcW w:w="3947" w:type="dxa"/>
-          </w:tcPr>
-          <w:p>
-            <w:pPr/>
-            <w:r>
-              <w:t xml:space="preserve">4,777. Chipanalog only; backup needs PCB space (ISO1042DW + isolated 5 V module)</w:t>
-            </w:r>
-          </w:p>
-        </w:tc>
-      </w:tr>
-      <w:tr>
-        <w:tc>
-          <w:tcPr>
-            <w:tcW w:w="2639" w:type="dxa"/>
-          </w:tcPr>
-          <w:p>
-            <w:pPr/>
-            <w:hyperlink r:id="rId8" w:history="1">
+            <w:tcW w:w="4037" w:type="dxa"/>
+          </w:tcPr>
+          <w:p>
+            <w:pPr/>
+            <w:r>
+              <w:t xml:space="preserve">In stock</w:t>
+            </w:r>
+          </w:p>
+        </w:tc>
+      </w:tr>
+      <w:tr>
+        <w:tc>
+          <w:tcPr>
+            <w:tcW w:w="2667" w:type="dxa"/>
+          </w:tcPr>
+          <w:p>
+            <w:pPr/>
+            <w:hyperlink r:id="rId3" w:history="1">
               <w:r>
                 <w:rPr>
                   <w:rStyle w:val="Hyperlink"/>
                 </w:rPr>
-                <w:t xml:space="preserve">CA-IS3742LW</w:t>
+                <w:t xml:space="preserve">CA-IS3642LVW</w:t>
               </w:r>
             </w:hyperlink>
           </w:p>
@@ -5758,37 +5760,37 @@
           <w:p>
             <w:pPr/>
             <w:r>
-              <w:t xml:space="preserve">C4944981</w:t>
-            </w:r>
-          </w:p>
-        </w:tc>
-        <w:tc>
-          <w:tcPr>
-            <w:tcW w:w="1430" w:type="dxa"/>
-          </w:tcPr>
-          <w:p>
-            <w:pPr/>
-            <w:r>
-              <w:t xml:space="preserve">about $1.20</w:t>
-            </w:r>
-          </w:p>
-        </w:tc>
-        <w:tc>
-          <w:tcPr>
-            <w:tcW w:w="3947" w:type="dxa"/>
-          </w:tcPr>
-          <w:p>
-            <w:pPr/>
-            <w:r>
-              <w:t xml:space="preserve">2,320. Default-low wide-body alternates: TI ISO7742FDWR, YLPTEC ISO7742W0-Y</w:t>
-            </w:r>
-          </w:p>
-        </w:tc>
-      </w:tr>
-      <w:tr>
-        <w:tc>
-          <w:tcPr>
-            <w:tcW w:w="2639" w:type="dxa"/>
+              <w:t xml:space="preserve">C7422564</w:t>
+            </w:r>
+          </w:p>
+        </w:tc>
+        <w:tc>
+          <w:tcPr>
+            <w:tcW w:w="1312" w:type="dxa"/>
+          </w:tcPr>
+          <w:p>
+            <w:pPr/>
+            <w:r>
+              <w:t xml:space="preserve">$2.51</w:t>
+            </w:r>
+          </w:p>
+        </w:tc>
+        <w:tc>
+          <w:tcPr>
+            <w:tcW w:w="4037" w:type="dxa"/>
+          </w:tcPr>
+          <w:p>
+            <w:pPr/>
+            <w:r>
+              <w:t xml:space="preserve">2, rest on JLC pre-order. CA-IS3642LW (no isolated power) and HVW (outputs default high) are not substitutes</w:t>
+            </w:r>
+          </w:p>
+        </w:tc>
+      </w:tr>
+      <w:tr>
+        <w:tc>
+          <w:tcPr>
+            <w:tcW w:w="2667" w:type="dxa"/>
           </w:tcPr>
           <w:p>
             <w:pPr/>
@@ -5818,7 +5820,7 @@
         </w:tc>
         <w:tc>
           <w:tcPr>
-            <w:tcW w:w="1430" w:type="dxa"/>
+            <w:tcW w:w="1312" w:type="dxa"/>
           </w:tcPr>
           <w:p>
             <w:pPr/>
@@ -5829,24 +5831,35 @@
         </w:tc>
         <w:tc>
           <w:tcPr>
-            <w:tcW w:w="3947" w:type="dxa"/>
-          </w:tcPr>
-          <w:p>
-            <w:pPr/>
-            <w:r>
-              <w:t xml:space="preserve">338 (112 boards). Alternates: UCC27211AQDDARQ1, UCC27211DR</w:t>
-            </w:r>
-          </w:p>
-        </w:tc>
-      </w:tr>
-      <w:tr>
-        <w:tc>
-          <w:tcPr>
-            <w:tcW w:w="2639" w:type="dxa"/>
-          </w:tcPr>
-          <w:p>
-            <w:pPr/>
+            <w:tcW w:w="4037" w:type="dxa"/>
+          </w:tcPr>
+          <w:p>
+            <w:pPr/>
+            <w:r>
+              <w:t xml:space="preserve">In stock. Second source </w:t>
+            </w:r>
             <w:hyperlink r:id="rId10" w:history="1">
+              <w:r>
+                <w:rPr>
+                  <w:rStyle w:val="Hyperlink"/>
+                </w:rPr>
+                <w:t xml:space="preserve">SLM27211CA-DG</w:t>
+              </w:r>
+            </w:hyperlink>
+            <w:r>
+              <w:t xml:space="preserve"> C967931 is out of stock</w:t>
+            </w:r>
+          </w:p>
+        </w:tc>
+      </w:tr>
+      <w:tr>
+        <w:tc>
+          <w:tcPr>
+            <w:tcW w:w="2667" w:type="dxa"/>
+          </w:tcPr>
+          <w:p>
+            <w:pPr/>
+            <w:hyperlink r:id="rId11" w:history="1">
               <w:r>
                 <w:rPr>
                   <w:rStyle w:val="Hyperlink"/>
@@ -5854,9 +5867,6 @@
                 <w:t xml:space="preserve">PSPMAA1770-220M-CGP</w:t>
               </w:r>
             </w:hyperlink>
-            <w:r>
-              <w:t xml:space="preserve"> (L1)</w:t>
-            </w:r>
           </w:p>
         </w:tc>
         <w:tc>
@@ -5872,7 +5882,7 @@
         </w:tc>
         <w:tc>
           <w:tcPr>
-            <w:tcW w:w="1430" w:type="dxa"/>
+            <w:tcW w:w="1312" w:type="dxa"/>
           </w:tcPr>
           <w:p>
             <w:pPr/>
@@ -5883,33 +5893,33 @@
         </w:tc>
         <w:tc>
           <w:tcPr>
-            <w:tcW w:w="3947" w:type="dxa"/>
-          </w:tcPr>
-          <w:p>
-            <w:pPr/>
-            <w:r>
-              <w:t xml:space="preserve">120. Alternates: SMMS1770-220M, Sunltech SLO1770C220MTT (23 A sat)</w:t>
-            </w:r>
-          </w:p>
-        </w:tc>
-      </w:tr>
-      <w:tr>
-        <w:tc>
-          <w:tcPr>
-            <w:tcW w:w="2639" w:type="dxa"/>
-          </w:tcPr>
-          <w:p>
-            <w:pPr/>
-            <w:hyperlink r:id="rId11" w:history="1">
+            <w:tcW w:w="4037" w:type="dxa"/>
+          </w:tcPr>
+          <w:p>
+            <w:pPr/>
+            <w:r>
+              <w:t xml:space="preserve">In stock. Alternate: Bourns SRP1770TA-220M</w:t>
+            </w:r>
+          </w:p>
+        </w:tc>
+      </w:tr>
+      <w:tr>
+        <w:tc>
+          <w:tcPr>
+            <w:tcW w:w="2667" w:type="dxa"/>
+          </w:tcPr>
+          <w:p>
+            <w:pPr/>
+            <w:hyperlink r:id="rId12" w:history="1">
               <w:r>
                 <w:rPr>
                   <w:rStyle w:val="Hyperlink"/>
                 </w:rPr>
-                <w:t xml:space="preserve">NCEP068N10G</w:t>
+                <w:t xml:space="preserve">NCEP0160AG</w:t>
               </w:r>
             </w:hyperlink>
             <w:r>
-              <w:t xml:space="preserve"> x4 (Q2, Q3, Q5, Q6)</w:t>
+              <w:t xml:space="preserve"> x4</w:t>
             </w:r>
           </w:p>
         </w:tc>
@@ -5920,41 +5930,41 @@
           <w:p>
             <w:pPr/>
             <w:r>
-              <w:t xml:space="preserve">C503061</w:t>
-            </w:r>
-          </w:p>
-        </w:tc>
-        <w:tc>
-          <w:tcPr>
-            <w:tcW w:w="1430" w:type="dxa"/>
-          </w:tcPr>
-          <w:p>
-            <w:pPr/>
-            <w:r>
-              <w:t xml:space="preserve">about $0.64</w:t>
-            </w:r>
-          </w:p>
-        </w:tc>
-        <w:tc>
-          <w:tcPr>
-            <w:tcW w:w="3947" w:type="dxa"/>
-          </w:tcPr>
-          <w:p>
-            <w:pPr/>
-            <w:r>
-              <w:t xml:space="preserve">7,577</w:t>
-            </w:r>
-          </w:p>
-        </w:tc>
-      </w:tr>
-      <w:tr>
-        <w:tc>
-          <w:tcPr>
-            <w:tcW w:w="2639" w:type="dxa"/>
-          </w:tcPr>
-          <w:p>
-            <w:pPr/>
-            <w:hyperlink r:id="rId12" w:history="1">
+              <w:t xml:space="preserve">C503012</w:t>
+            </w:r>
+          </w:p>
+        </w:tc>
+        <w:tc>
+          <w:tcPr>
+            <w:tcW w:w="1312" w:type="dxa"/>
+          </w:tcPr>
+          <w:p>
+            <w:pPr/>
+            <w:r>
+              <w:t xml:space="preserve">$0.74</w:t>
+            </w:r>
+          </w:p>
+        </w:tc>
+        <w:tc>
+          <w:tcPr>
+            <w:tcW w:w="4037" w:type="dxa"/>
+          </w:tcPr>
+          <w:p>
+            <w:pPr/>
+            <w:r>
+              <w:t xml:space="preserve">In stock</w:t>
+            </w:r>
+          </w:p>
+        </w:tc>
+      </w:tr>
+      <w:tr>
+        <w:tc>
+          <w:tcPr>
+            <w:tcW w:w="2667" w:type="dxa"/>
+          </w:tcPr>
+          <w:p>
+            <w:pPr/>
+            <w:hyperlink r:id="rId13" w:history="1">
               <w:r>
                 <w:rPr>
                   <w:rStyle w:val="Hyperlink"/>
@@ -5963,7 +5973,7 @@
               </w:r>
             </w:hyperlink>
             <w:r>
-              <w:t xml:space="preserve"> x2 (Q1, Q4)</w:t>
+              <w:t xml:space="preserve"> x2</w:t>
             </w:r>
           </w:p>
         </w:tc>
@@ -5980,7 +5990,7 @@
         </w:tc>
         <w:tc>
           <w:tcPr>
-            <w:tcW w:w="1430" w:type="dxa"/>
+            <w:tcW w:w="1312" w:type="dxa"/>
           </w:tcPr>
           <w:p>
             <w:pPr/>
@@ -5991,20 +6001,20 @@
         </w:tc>
         <w:tc>
           <w:tcPr>
-            <w:tcW w:w="3947" w:type="dxa"/>
-          </w:tcPr>
-          <w:p>
-            <w:pPr/>
-            <w:r>
-              <w:t xml:space="preserve">4,695</w:t>
-            </w:r>
-          </w:p>
-        </w:tc>
-      </w:tr>
-      <w:tr>
-        <w:tc>
-          <w:tcPr>
-            <w:tcW w:w="2639" w:type="dxa"/>
+            <w:tcW w:w="4037" w:type="dxa"/>
+          </w:tcPr>
+          <w:p>
+            <w:pPr/>
+            <w:r>
+              <w:t xml:space="preserve">In stock</w:t>
+            </w:r>
+          </w:p>
+        </w:tc>
+      </w:tr>
+      <w:tr>
+        <w:tc>
+          <w:tcPr>
+            <w:tcW w:w="2667" w:type="dxa"/>
           </w:tcPr>
           <w:p>
             <w:pPr/>
@@ -6026,31 +6036,31 @@
         </w:tc>
         <w:tc>
           <w:tcPr>
-            <w:tcW w:w="1430" w:type="dxa"/>
-          </w:tcPr>
-          <w:p>
-            <w:pPr/>
-            <w:r>
-              <w:t xml:space="preserve">about $0.05</w:t>
-            </w:r>
-          </w:p>
-        </w:tc>
-        <w:tc>
-          <w:tcPr>
-            <w:tcW w:w="3947" w:type="dxa"/>
-          </w:tcPr>
-          <w:p>
-            <w:pPr/>
-            <w:r>
-              <w:t xml:space="preserve">261,555</w:t>
-            </w:r>
-          </w:p>
-        </w:tc>
-      </w:tr>
-      <w:tr>
-        <w:tc>
-          <w:tcPr>
-            <w:tcW w:w="2639" w:type="dxa"/>
+            <w:tcW w:w="1312" w:type="dxa"/>
+          </w:tcPr>
+          <w:p>
+            <w:pPr/>
+            <w:r>
+              <w:t xml:space="preserve">about $0.36</w:t>
+            </w:r>
+          </w:p>
+        </w:tc>
+        <w:tc>
+          <w:tcPr>
+            <w:tcW w:w="4037" w:type="dxa"/>
+          </w:tcPr>
+          <w:p>
+            <w:pPr/>
+            <w:r>
+              <w:t xml:space="preserve">69 (enough for 5 boards). Samsung CL32B225KCJSNNE C55151 is out of stock; any 100 V X7R 1210 works</w:t>
+            </w:r>
+          </w:p>
+        </w:tc>
+      </w:tr>
+      <w:tr>
+        <w:tc>
+          <w:tcPr>
+            <w:tcW w:w="2667" w:type="dxa"/>
           </w:tcPr>
           <w:p>
             <w:pPr/>
@@ -6072,7 +6082,7 @@
         </w:tc>
         <w:tc>
           <w:tcPr>
-            <w:tcW w:w="1430" w:type="dxa"/>
+            <w:tcW w:w="1312" w:type="dxa"/>
           </w:tcPr>
           <w:p>
             <w:pPr/>
@@ -6083,24 +6093,24 @@
         </w:tc>
         <w:tc>
           <w:tcPr>
-            <w:tcW w:w="3947" w:type="dxa"/>
-          </w:tcPr>
-          <w:p>
-            <w:pPr/>
-            <w:r>
-              <w:t xml:space="preserve">902. Alternates: Murata GRM31C5C2A104JA01L, TDK C3216C0G2A104JT000E</w:t>
-            </w:r>
-          </w:p>
-        </w:tc>
-      </w:tr>
-      <w:tr>
-        <w:tc>
-          <w:tcPr>
-            <w:tcW w:w="2639" w:type="dxa"/>
-          </w:tcPr>
-          <w:p>
-            <w:pPr/>
-            <w:hyperlink r:id="rId13" w:history="1">
+            <w:tcW w:w="4037" w:type="dxa"/>
+          </w:tcPr>
+          <w:p>
+            <w:pPr/>
+            <w:r>
+              <w:t xml:space="preserve">892</w:t>
+            </w:r>
+          </w:p>
+        </w:tc>
+      </w:tr>
+      <w:tr>
+        <w:tc>
+          <w:tcPr>
+            <w:tcW w:w="2667" w:type="dxa"/>
+          </w:tcPr>
+          <w:p>
+            <w:pPr/>
+            <w:hyperlink r:id="rId14" w:history="1">
               <w:r>
                 <w:rPr>
                   <w:rStyle w:val="Hyperlink"/>
@@ -6123,7 +6133,7 @@
         </w:tc>
         <w:tc>
           <w:tcPr>
-            <w:tcW w:w="1430" w:type="dxa"/>
+            <w:tcW w:w="1312" w:type="dxa"/>
           </w:tcPr>
           <w:p>
             <w:pPr/>
@@ -6134,25 +6144,25 @@
         </w:tc>
         <w:tc>
           <w:tcPr>
-            <w:tcW w:w="3947" w:type="dxa"/>
-          </w:tcPr>
-          <w:p>
-            <w:pPr/>
-            <w:r>
-              <w:t xml:space="preserve">43,365</w:t>
-            </w:r>
-          </w:p>
-        </w:tc>
-      </w:tr>
-      <w:tr>
-        <w:tc>
-          <w:tcPr>
-            <w:tcW w:w="2639" w:type="dxa"/>
-          </w:tcPr>
-          <w:p>
-            <w:pPr/>
-            <w:r>
-              <w:t xml:space="preserve">FNR5040S470MT 47 uH x2 (L2, L3)</w:t>
+            <w:tcW w:w="4037" w:type="dxa"/>
+          </w:tcPr>
+          <w:p>
+            <w:pPr/>
+            <w:r>
+              <w:t xml:space="preserve">In stock</w:t>
+            </w:r>
+          </w:p>
+        </w:tc>
+      </w:tr>
+      <w:tr>
+        <w:tc>
+          <w:tcPr>
+            <w:tcW w:w="2667" w:type="dxa"/>
+          </w:tcPr>
+          <w:p>
+            <w:pPr/>
+            <w:r>
+              <w:t xml:space="preserve">SWPA5040S470MT 47 uH 1.1 A x2 (L2, L3)</w:t>
             </w:r>
           </w:p>
         </w:tc>
@@ -6163,37 +6173,37 @@
           <w:p>
             <w:pPr/>
             <w:r>
-              <w:t xml:space="preserve">C167974</w:t>
-            </w:r>
-          </w:p>
-        </w:tc>
-        <w:tc>
-          <w:tcPr>
-            <w:tcW w:w="1430" w:type="dxa"/>
-          </w:tcPr>
-          <w:p>
-            <w:pPr/>
-            <w:r>
-              <w:t xml:space="preserve">about $0.05</w:t>
-            </w:r>
-          </w:p>
-        </w:tc>
-        <w:tc>
-          <w:tcPr>
-            <w:tcW w:w="3947" w:type="dxa"/>
-          </w:tcPr>
-          <w:p>
-            <w:pPr/>
-            <w:r>
-              <w:t xml:space="preserve">35,940. Replaces SWPA5040S470MT (no longer listed); land pattern identical</w:t>
-            </w:r>
-          </w:p>
-        </w:tc>
-      </w:tr>
-      <w:tr>
-        <w:tc>
-          <w:tcPr>
-            <w:tcW w:w="2639" w:type="dxa"/>
+              <w:t xml:space="preserve">C86617</w:t>
+            </w:r>
+          </w:p>
+        </w:tc>
+        <w:tc>
+          <w:tcPr>
+            <w:tcW w:w="1312" w:type="dxa"/>
+          </w:tcPr>
+          <w:p>
+            <w:pPr/>
+            <w:r>
+              <w:t xml:space="preserve">about $0.12</w:t>
+            </w:r>
+          </w:p>
+        </w:tc>
+        <w:tc>
+          <w:tcPr>
+            <w:tcW w:w="4037" w:type="dxa"/>
+          </w:tcPr>
+          <w:p>
+            <w:pPr/>
+            <w:r>
+              <w:t xml:space="preserve">24,085. Same 5040 footprint: SRN5040-470M, NRS5040T470MMGK, NRSC5040-470M</w:t>
+            </w:r>
+          </w:p>
+        </w:tc>
+      </w:tr>
+      <w:tr>
+        <w:tc>
+          <w:tcPr>
+            <w:tcW w:w="2667" w:type="dxa"/>
           </w:tcPr>
           <w:p>
             <w:pPr/>
@@ -6215,35 +6225,35 @@
         </w:tc>
         <w:tc>
           <w:tcPr>
-            <w:tcW w:w="1430" w:type="dxa"/>
-          </w:tcPr>
-          <w:p>
-            <w:pPr/>
-            <w:r>
-              <w:t xml:space="preserve">about $0.48</w:t>
-            </w:r>
-          </w:p>
-        </w:tc>
-        <w:tc>
-          <w:tcPr>
-            <w:tcW w:w="3947" w:type="dxa"/>
-          </w:tcPr>
-          <w:p>
-            <w:pPr/>
-            <w:r>
-              <w:t xml:space="preserve">765. Alternate: Reomax R12.000.7</w:t>
-            </w:r>
-          </w:p>
-        </w:tc>
-      </w:tr>
-      <w:tr>
-        <w:tc>
-          <w:tcPr>
-            <w:tcW w:w="2639" w:type="dxa"/>
-          </w:tcPr>
-          <w:p>
-            <w:pPr/>
-            <w:hyperlink r:id="rId14" w:history="1">
+            <w:tcW w:w="1312" w:type="dxa"/>
+          </w:tcPr>
+          <w:p>
+            <w:pPr/>
+            <w:r>
+              <w:t xml:space="preserve">about $0.45</w:t>
+            </w:r>
+          </w:p>
+        </w:tc>
+        <w:tc>
+          <w:tcPr>
+            <w:tcW w:w="4037" w:type="dxa"/>
+          </w:tcPr>
+          <w:p>
+            <w:pPr/>
+            <w:r>
+              <w:t xml:space="preserve">376. Same 1206 footprint: Schurter 3413.0326.11</w:t>
+            </w:r>
+          </w:p>
+        </w:tc>
+      </w:tr>
+      <w:tr>
+        <w:tc>
+          <w:tcPr>
+            <w:tcW w:w="2667" w:type="dxa"/>
+          </w:tcPr>
+          <w:p>
+            <w:pPr/>
+            <w:hyperlink r:id="rId15" w:history="1">
               <w:r>
                 <w:rPr>
                   <w:rStyle w:val="Hyperlink"/>
@@ -6254,7 +6264,7 @@
             <w:r>
               <w:t xml:space="preserve"> / </w:t>
             </w:r>
-            <w:hyperlink r:id="rId15" w:history="1">
+            <w:hyperlink r:id="rId16" w:history="1">
               <w:r>
                 <w:rPr>
                   <w:rStyle w:val="Hyperlink"/>
@@ -6277,7 +6287,7 @@
         </w:tc>
         <w:tc>
           <w:tcPr>
-            <w:tcW w:w="1430" w:type="dxa"/>
+            <w:tcW w:w="1312" w:type="dxa"/>
           </w:tcPr>
           <w:p>
             <w:pPr/>
@@ -6288,25 +6298,25 @@
         </w:tc>
         <w:tc>
           <w:tcPr>
-            <w:tcW w:w="3947" w:type="dxa"/>
-          </w:tcPr>
-          <w:p>
-            <w:pPr/>
-            <w:r>
-              <w:t xml:space="preserve">5,210 / 55,660</w:t>
-            </w:r>
-          </w:p>
-        </w:tc>
-      </w:tr>
-      <w:tr>
-        <w:tc>
-          <w:tcPr>
-            <w:tcW w:w="2639" w:type="dxa"/>
-          </w:tcPr>
-          <w:p>
-            <w:pPr/>
-            <w:r>
-              <w:t xml:space="preserve">PA3855.006NLT (T2)</w:t>
+            <w:tcW w:w="4037" w:type="dxa"/>
+          </w:tcPr>
+          <w:p>
+            <w:pPr/>
+            <w:r>
+              <w:t xml:space="preserve">In stock</w:t>
+            </w:r>
+          </w:p>
+        </w:tc>
+      </w:tr>
+      <w:tr>
+        <w:tc>
+          <w:tcPr>
+            <w:tcW w:w="2667" w:type="dxa"/>
+          </w:tcPr>
+          <w:p>
+            <w:pPr/>
+            <w:r>
+              <w:t xml:space="preserve">REF3030AIDBZR (ADC reference, removed in Rev E)</w:t>
             </w:r>
           </w:p>
         </w:tc>
@@ -6317,29 +6327,29 @@
           <w:p>
             <w:pPr/>
             <w:r>
-              <w:t xml:space="preserve">C5718384</w:t>
-            </w:r>
-          </w:p>
-        </w:tc>
-        <w:tc>
-          <w:tcPr>
-            <w:tcW w:w="1430" w:type="dxa"/>
-          </w:tcPr>
-          <w:p>
-            <w:pPr/>
-            <w:r>
-              <w:t xml:space="preserve">about $1.15</w:t>
-            </w:r>
-          </w:p>
-        </w:tc>
-        <w:tc>
-          <w:tcPr>
-            <w:tcW w:w="3947" w:type="dxa"/>
-          </w:tcPr>
-          <w:p>
-            <w:pPr/>
-            <w:r>
-              <w:t xml:space="preserve">102. Pulse only</w:t>
+              <w:t xml:space="preserve">C38423</w:t>
+            </w:r>
+          </w:p>
+        </w:tc>
+        <w:tc>
+          <w:tcPr>
+            <w:tcW w:w="1312" w:type="dxa"/>
+          </w:tcPr>
+          <w:p>
+            <w:pPr/>
+            <w:r>
+              <w:t xml:space="preserve">about $0.50 (estimate)</w:t>
+            </w:r>
+          </w:p>
+        </w:tc>
+        <w:tc>
+          <w:tcPr>
+            <w:tcW w:w="4037" w:type="dxa"/>
+          </w:tcPr>
+          <w:p>
+            <w:pPr/>
+            <w:r>
+              <w:t xml:space="preserve">In stock</w:t>
             </w:r>
           </w:p>
         </w:tc>
@@ -7408,6 +7418,18 @@
     </w:p>
     <w:p>
       <w:pPr>
+        <w:pStyle w:val="ListParagraph"/>
+        <w:numPr>
+          <w:ilvl w:val="0"/>
+          <w:numId w:val="10"/>
+        </w:numPr>
+      </w:pPr>
+      <w:r>
+        <w:t>Rev E2 (20 Oct): R123–R129 were put into the existing debug traces, keeping the routing as it was. The Rev E DRC failures are fixed as well: 16 courtyard overlaps (at T1/CR1–CR6 and R64, at T2 with D8, C94, R116, C95 and the flyback FET Q11 and its shunt R114, plus C98/R122, C69/U11 and C34/U1) were cleared by moving those parts 0.05–2 mm and re-attaching their tracks, and the 4 silkscreen warnings went with them. Checks afterwards: DRC 0 errors, 0 warnings, 0 unconnected; schematic-to-PCB parity 291 parts, 796 pads, no mismatch.</w:t>
+      </w:r>
+    </w:p>
+    <w:p>
+      <w:pPr>
         <w:pStyle w:val="Heading3"/>
       </w:pPr>
       <w:r>
@@ -7986,7 +8008,7 @@
       <w:r>
         <w:t xml:space="preserve">Import the zip from the EasyEDA Pro start page, or through its Format Converter. EasyEDA's documentation lists KiCad 5.1 as supported and is unclear about newer versions, so the schematic is written in KiCad 6 format, the most widely accepted. The PCB file is KiCad 7 format because that is what the generator writes. (</w:t>
       </w:r>
-      <w:hyperlink r:id="rId16" w:history="1">
+      <w:hyperlink r:id="rId17" w:history="1">
         <w:r>
           <w:rPr>
             <w:rStyle w:val="Hyperlink"/>
@@ -7997,7 +8019,7 @@
       <w:r>
         <w:t xml:space="preserve">, </w:t>
       </w:r>
-      <w:hyperlink r:id="rId17" w:history="1">
+      <w:hyperlink r:id="rId18" w:history="1">
         <w:r>
           <w:rPr>
             <w:rStyle w:val="Hyperlink"/>
@@ -8160,7 +8182,7 @@
       <w:r>
         <w:t xml:space="preserve">Sources: component data from the LCSC/JLCPCB listings and datasheets linked above, and the </w:t>
       </w:r>
-      <w:hyperlink r:id="rId18" w:history="1">
+      <w:hyperlink r:id="rId19" w:history="1">
         <w:r>
           <w:rPr>
             <w:rStyle w:val="Hyperlink"/>
@@ -8171,7 +8193,7 @@
       <w:r>
         <w:t xml:space="preserve">, </w:t>
       </w:r>
-      <w:hyperlink r:id="rId19" w:history="1">
+      <w:hyperlink r:id="rId20" w:history="1">
         <w:r>
           <w:rPr>
             <w:rStyle w:val="Hyperlink"/>
@@ -8182,7 +8204,7 @@
       <w:r>
         <w:t xml:space="preserve"> and </w:t>
       </w:r>
-      <w:hyperlink r:id="rId20" w:history="1">
+      <w:hyperlink r:id="rId21" w:history="1">
         <w:r>
           <w:rPr>
             <w:rStyle w:val="Hyperlink"/>

</xml_diff>